<commit_message>
chore: weekly refresh 2026-08-13 11:57
</commit_message>
<xml_diff>
--- a/_build_docx/家装建材家具行业竞争情报月报_汇报稿.docx
+++ b/_build_docx/家装建材家具行业竞争情报月报_汇报稿.docx
@@ -71,7 +71,7 @@
           <w:color w:val="666666"/>
           <w:sz w:val="22"/>
         </w:rPr>
-        <w:t>数据截止：2026-08-12</w:t>
+        <w:t>数据截止：2026-08-13</w:t>
       </w:r>
     </w:p>
     <w:p>
@@ -159,7 +159,7 @@
           <w:b w:val="0"/>
           <w:sz w:val="22"/>
         </w:rPr>
-        <w:t>8月上旬到中旬（截至08-12）呈现『宏观继续探底、资本动作密集、地方补贴下沉』三条主线。宏观端7月读数集中落地：PMI全面回落（制造业49.2%、建筑业47.0%）、CPI中『居住』-0.3%为七大类唯一下降项、PPI +3.5%与CPI +0.5%的剪刀差扩至3.0个百分点，家居建材中下游被上游成本与终端价格两头挤压；唯一强项是外需，前7个月进出口30.13万亿(+17.3%)、7月单月+19.2%，与国内家具-6.6%/建材-10.5%形成极强背离，确认产业链『外热内冷』。地产端百城新房环比+0.26%微涨、二手房-0.44%续跌，中指第32周二手房成交同比+7.8%但8月累计已转负(-0.3%)，三季度存量翻新的自然引流窗口偏弱。商家端2026H1中报8月7日开闸，首批4家已充分说明『看归母增速会看错人』：伟星新材归母+43.90%但扣非EPS仅0.14元对基本EPS 0.25元、增长来自非经常性损益；江河集团双位数双增但每股经营现金流-0.62元、以垫资换增长；悍高集团是唯一利润与现金流同步为正；塔牌集团归母近乎腰斩。资本与治理动作同样密集：顾家18.71亿定增落地、控股方增持至37.39%但发行价从19.15元下修至17.94元；居然智家实控人交接进入收尾、杨芳控制43.93%；惠达以『股权1元+债权6800万』剥离亏损陶瓷资产；箭牌2023年激励计划因考核未达成整体作废；欧派与好莱客同期把资金转向现金管理与私募基金，定制龙头主动收缩资本开支。政策端最值得警惕的是深圳把线上国补资格从平台级下沉到店铺级白名单，若被复制将直接改变国补品类的店铺间流量与GMV分配；盐城盐都区400万消费券中家装家居100万元、为家电50万元的两倍，与7月北京/福建/重庆的智能家居扩围一起，说明地方财政对『家装』的独立支持正在成形。平台端京东在8月上旬密集修订经营类目阈值(08-17生效)与不当使用关键词细则(08-19生效)，并调整家电家居安装维修经营模式，8月下旬可能形成一波中小商家的平台间迁移。</w:t>
+        <w:t>8月上旬至08-13：家居建材『中报密集披露+818大促季+地方国补滚动扩容』三线并进。中报端结构性分化加剧——江河集团(建筑装饰/幕墙工程端)H1净利+34%并触发股价异动，与地产链零售家居(慕思/志邦/惠达/金牌预亏预减)形成鲜明对照，扣非与经营现金流才是真分水岭；欧派、好莱客把闲置资金转向理财/私募，龙头主动收缩资本开支。渠道端818打响家具补贴战：京东家具超级品类日携马頔办『亿元补贴至高返50%』，微信小店重构家具类目(08-24生效)，快手818宠粉节(08-04~08-28)；曲美家居把抖音自播费率打到平台下限5%，折射内容电商『降费率保ROI』。政策端地方国补白名单滚动扩容(福建三明尤溪第十七批/武汉第六批)、口径细化(南平『智能沙发』并入按摩椅不得重复申领)，标准端CABEE辐射隔热涂料团标(10-01实施)、CBDA标准管理办法修订(08-11)落地。宏观硬数据(7月社零/70城房价/规上工业)定于08-17、7月BHI预计08-15，本期尚未公布，下期二次补采。</w:t>
       </w:r>
     </w:p>
     <w:p>
@@ -173,7 +173,7 @@
           <w:color w:val="2E5B9A"/>
           <w:sz w:val="27"/>
         </w:rPr>
-        <w:t>1.一　宏观数据（7条）</w:t>
+        <w:t>1.一　宏观数据（8条）</w:t>
       </w:r>
     </w:p>
     <w:tbl>
@@ -286,7 +286,7 @@
                 <w:b w:val="0"/>
                 <w:sz w:val="19"/>
               </w:rPr>
-              <w:t>2026-07-31</w:t>
+              <w:t>2026-08-13</w:t>
             </w:r>
           </w:p>
         </w:tc>
@@ -304,7 +304,7 @@
                 <w:b w:val="0"/>
                 <w:sz w:val="19"/>
               </w:rPr>
-              <w:t>7月PMI全面回落：制造业49.2%、建筑业47.0%，需求端先行指标走弱</w:t>
+              <w:t>7月宏观硬数据本周尚未落地：社零/规上工业/70城房价定于08-17、BHI预计08-15</w:t>
             </w:r>
           </w:p>
         </w:tc>
@@ -322,7 +322,7 @@
                 <w:b w:val="0"/>
                 <w:sz w:val="19"/>
               </w:rPr>
-              <w:t>高</w:t>
+              <w:t>低</w:t>
             </w:r>
           </w:p>
         </w:tc>
@@ -340,7 +340,7 @@
                 <w:b w:val="0"/>
                 <w:sz w:val="19"/>
               </w:rPr>
-              <w:t>国家统计局</w:t>
+              <w:t>国家统计局发布日程/CBMCA历史节奏</w:t>
             </w:r>
           </w:p>
         </w:tc>
@@ -361,7 +361,7 @@
                 <w:b w:val="0"/>
                 <w:sz w:val="19"/>
               </w:rPr>
-              <w:t>2026-08-03</w:t>
+              <w:t>2026-07-31</w:t>
             </w:r>
           </w:p>
         </w:tc>
@@ -380,7 +380,7 @@
                 <w:b w:val="0"/>
                 <w:sz w:val="19"/>
               </w:rPr>
-              <w:t>1-7月百强房企销售1.80万亿，降幅连续五个月收窄</w:t>
+              <w:t>7月PMI全面回落：制造业49.2%、建筑业47.0%，需求端先行指标走弱</w:t>
             </w:r>
           </w:p>
         </w:tc>
@@ -399,7 +399,7 @@
                 <w:b w:val="0"/>
                 <w:sz w:val="19"/>
               </w:rPr>
-              <w:t>中</w:t>
+              <w:t>高</w:t>
             </w:r>
           </w:p>
         </w:tc>
@@ -418,7 +418,7 @@
                 <w:b w:val="0"/>
                 <w:sz w:val="19"/>
               </w:rPr>
-              <w:t>中指研究院(财联社转载)</w:t>
+              <w:t>国家统计局</w:t>
             </w:r>
           </w:p>
         </w:tc>
@@ -438,7 +438,7 @@
                 <w:b w:val="0"/>
                 <w:sz w:val="19"/>
               </w:rPr>
-              <w:t>2026-08-01</w:t>
+              <w:t>2026-08-03</w:t>
             </w:r>
           </w:p>
         </w:tc>
@@ -456,7 +456,7 @@
                 <w:b w:val="0"/>
                 <w:sz w:val="19"/>
               </w:rPr>
-              <w:t>7月百城房价：新房环比+0.26%微涨、二手房-0.44%续跌</w:t>
+              <w:t>1-7月百强房企销售1.80万亿，降幅连续五个月收窄</w:t>
             </w:r>
           </w:p>
         </w:tc>
@@ -492,7 +492,7 @@
                 <w:b w:val="0"/>
                 <w:sz w:val="19"/>
               </w:rPr>
-              <w:t>中指研究院(新浪财经转载)</w:t>
+              <w:t>中指研究院(财联社转载)</w:t>
             </w:r>
           </w:p>
         </w:tc>
@@ -513,7 +513,7 @@
                 <w:b w:val="0"/>
                 <w:sz w:val="19"/>
               </w:rPr>
-              <w:t>2026-08-03</w:t>
+              <w:t>2026-08-01</w:t>
             </w:r>
           </w:p>
         </w:tc>
@@ -532,7 +532,7 @@
                 <w:b w:val="0"/>
                 <w:sz w:val="19"/>
               </w:rPr>
-              <w:t>7月建材工业景气指数MPI 95.3点，环比降6.0点续处非景气区间</w:t>
+              <w:t>7月百城房价：新房环比+0.26%微涨、二手房-0.44%续跌</w:t>
             </w:r>
           </w:p>
         </w:tc>
@@ -570,7 +570,7 @@
                 <w:b w:val="0"/>
                 <w:sz w:val="19"/>
               </w:rPr>
-              <w:t>中国建筑材料联合会</w:t>
+              <w:t>中指研究院(新浪财经转载)</w:t>
             </w:r>
           </w:p>
         </w:tc>
@@ -590,7 +590,7 @@
                 <w:b w:val="0"/>
                 <w:sz w:val="19"/>
               </w:rPr>
-              <w:t>2026-08-09</w:t>
+              <w:t>2026-08-03</w:t>
             </w:r>
           </w:p>
         </w:tc>
@@ -608,7 +608,7 @@
                 <w:b w:val="0"/>
                 <w:sz w:val="19"/>
               </w:rPr>
-              <w:t>7月CPI同比+0.5%，『居住』-0.3%是七大类中唯一下降项；PPI+3.5%，剪刀差扩至3.0pct</w:t>
+              <w:t>7月建材工业景气指数MPI 95.3点，环比降6.0点续处非景气区间</w:t>
             </w:r>
           </w:p>
         </w:tc>
@@ -626,7 +626,7 @@
                 <w:b w:val="0"/>
                 <w:sz w:val="19"/>
               </w:rPr>
-              <w:t>高</w:t>
+              <w:t>中</w:t>
             </w:r>
           </w:p>
         </w:tc>
@@ -644,7 +644,7 @@
                 <w:b w:val="0"/>
                 <w:sz w:val="19"/>
               </w:rPr>
-              <w:t>国家统计局</w:t>
+              <w:t>中国建筑材料联合会</w:t>
             </w:r>
           </w:p>
         </w:tc>
@@ -665,7 +665,7 @@
                 <w:b w:val="0"/>
                 <w:sz w:val="19"/>
               </w:rPr>
-              <w:t>2026-08-07</w:t>
+              <w:t>2026-08-09</w:t>
             </w:r>
           </w:p>
         </w:tc>
@@ -684,7 +684,7 @@
                 <w:b w:val="0"/>
                 <w:sz w:val="19"/>
               </w:rPr>
-              <w:t>前7个月货物贸易进出口30.13万亿元(+17.3%)，7月单月4.66万亿(+19.2%)，外需与内需背离加剧</w:t>
+              <w:t>7月CPI同比+0.5%，『居住』-0.3%是七大类中唯一下降项；PPI+3.5%，剪刀差扩至3.0pct</w:t>
             </w:r>
           </w:p>
         </w:tc>
@@ -722,7 +722,7 @@
                 <w:b w:val="0"/>
                 <w:sz w:val="19"/>
               </w:rPr>
-              <w:t>海关总署（经央视新闻/中国日报网转载）</w:t>
+              <w:t>国家统计局</w:t>
             </w:r>
           </w:p>
         </w:tc>
@@ -742,6 +742,81 @@
                 <w:b w:val="0"/>
                 <w:sz w:val="19"/>
               </w:rPr>
+              <w:t>2026-08-07</w:t>
+            </w:r>
+          </w:p>
+        </w:tc>
+        <w:tc>
+          <w:tcPr>
+            <w:tcW w:type="dxa" w:w="5386"/>
+          </w:tcPr>
+          <w:p>
+            <w:pPr>
+              <w:jc w:val="center"/>
+            </w:pPr>
+            <w:r>
+              <w:rPr>
+                <w:rFonts w:ascii="Arial" w:hAnsi="Arial" w:eastAsia="宋体"/>
+                <w:b w:val="0"/>
+                <w:sz w:val="19"/>
+              </w:rPr>
+              <w:t>前7个月货物贸易进出口30.13万亿元(+17.3%)，7月单月4.66万亿(+19.2%)，外需与内需背离加剧</w:t>
+            </w:r>
+          </w:p>
+        </w:tc>
+        <w:tc>
+          <w:tcPr>
+            <w:tcW w:type="dxa" w:w="737"/>
+          </w:tcPr>
+          <w:p>
+            <w:pPr>
+              <w:jc w:val="center"/>
+            </w:pPr>
+            <w:r>
+              <w:rPr>
+                <w:rFonts w:ascii="Arial" w:hAnsi="Arial" w:eastAsia="宋体"/>
+                <w:b w:val="0"/>
+                <w:sz w:val="19"/>
+              </w:rPr>
+              <w:t>高</w:t>
+            </w:r>
+          </w:p>
+        </w:tc>
+        <w:tc>
+          <w:tcPr>
+            <w:tcW w:type="dxa" w:w="1814"/>
+          </w:tcPr>
+          <w:p>
+            <w:pPr>
+              <w:jc w:val="center"/>
+            </w:pPr>
+            <w:r>
+              <w:rPr>
+                <w:rFonts w:ascii="Arial" w:hAnsi="Arial" w:eastAsia="宋体"/>
+                <w:b w:val="0"/>
+                <w:sz w:val="19"/>
+              </w:rPr>
+              <w:t>海关总署（经央视新闻/中国日报网转载）</w:t>
+            </w:r>
+          </w:p>
+        </w:tc>
+      </w:tr>
+      <w:tr>
+        <w:tc>
+          <w:tcPr>
+            <w:tcW w:type="dxa" w:w="1247"/>
+            <w:shd w:val="clear" w:fill="F4F6F9"/>
+          </w:tcPr>
+          <w:p>
+            <w:pPr>
+              <w:jc w:val="left"/>
+            </w:pPr>
+            <w:r>
+              <w:rPr>
+                <w:rFonts w:ascii="Arial" w:hAnsi="Arial" w:eastAsia="宋体"/>
+                <w:b w:val="0"/>
+                <w:sz w:val="19"/>
+              </w:rPr>
               <w:t>2026-08-10</w:t>
             </w:r>
           </w:p>
@@ -749,6 +824,7 @@
         <w:tc>
           <w:tcPr>
             <w:tcW w:type="dxa" w:w="5386"/>
+            <w:shd w:val="clear" w:fill="F4F6F9"/>
           </w:tcPr>
           <w:p>
             <w:pPr>
@@ -767,6 +843,7 @@
         <w:tc>
           <w:tcPr>
             <w:tcW w:type="dxa" w:w="737"/>
+            <w:shd w:val="clear" w:fill="F4F6F9"/>
           </w:tcPr>
           <w:p>
             <w:pPr>
@@ -785,6 +862,7 @@
         <w:tc>
           <w:tcPr>
             <w:tcW w:type="dxa" w:w="1814"/>
+            <w:shd w:val="clear" w:fill="F4F6F9"/>
           </w:tcPr>
           <w:p>
             <w:pPr>
@@ -823,7 +901,7 @@
           <w:color w:val="333333"/>
           <w:sz w:val="21"/>
         </w:rPr>
-        <w:t>本组共7条，其中高影响3条。三条宏观信号共同确认需求端全面深跌：家具类零售-6.6%、建材类-10.5%均大幅跑输社零大盘+1.0%，叠加6月BHI环比-16.34进入传统淡季。对天猫家装运营而言，7月大盘承压是既定基调，增长只能来自结构性机会（品类升级、以旧换新、头部集中），不能指望大盘自然回暖。</w:t>
+        <w:t>本组共8条，其中高影响3条。三条宏观信号共同确认需求端全面深跌：家具类零售-6.6%、建材类-10.5%均大幅跑输社零大盘+1.0%，叠加6月BHI环比-16.34进入传统淡季。对天猫家装运营而言，7月大盘承压是既定基调，增长只能来自结构性机会（品类升级、以旧换新、头部集中），不能指望大盘自然回暖。</w:t>
       </w:r>
     </w:p>
     <w:p>
@@ -837,7 +915,7 @@
           <w:color w:val="2E5B9A"/>
           <w:sz w:val="27"/>
         </w:rPr>
-        <w:t>1.二　平台大事（2条）</w:t>
+        <w:t>1.二　平台大事（4条）</w:t>
       </w:r>
     </w:p>
     <w:tbl>
@@ -931,6 +1009,158 @@
                 <w:sz w:val="19"/>
               </w:rPr>
               <w:t>来源</w:t>
+            </w:r>
+          </w:p>
+        </w:tc>
+      </w:tr>
+      <w:tr>
+        <w:tc>
+          <w:tcPr>
+            <w:tcW w:type="dxa" w:w="1247"/>
+          </w:tcPr>
+          <w:p>
+            <w:pPr>
+              <w:jc w:val="left"/>
+            </w:pPr>
+            <w:r>
+              <w:rPr>
+                <w:rFonts w:ascii="Arial" w:hAnsi="Arial" w:eastAsia="宋体"/>
+                <w:b w:val="0"/>
+                <w:sz w:val="19"/>
+              </w:rPr>
+              <w:t>2026-08-11</w:t>
+            </w:r>
+          </w:p>
+        </w:tc>
+        <w:tc>
+          <w:tcPr>
+            <w:tcW w:type="dxa" w:w="5386"/>
+          </w:tcPr>
+          <w:p>
+            <w:pPr>
+              <w:jc w:val="center"/>
+            </w:pPr>
+            <w:r>
+              <w:rPr>
+                <w:rFonts w:ascii="Arial" w:hAnsi="Arial" w:eastAsia="宋体"/>
+                <w:b w:val="0"/>
+                <w:sz w:val="19"/>
+              </w:rPr>
+              <w:t>818家具战打响：京东家具超级品类日携马頔办『新家发补会』，亿元补贴至高返50%</w:t>
+            </w:r>
+          </w:p>
+        </w:tc>
+        <w:tc>
+          <w:tcPr>
+            <w:tcW w:type="dxa" w:w="737"/>
+          </w:tcPr>
+          <w:p>
+            <w:pPr>
+              <w:jc w:val="center"/>
+            </w:pPr>
+            <w:r>
+              <w:rPr>
+                <w:rFonts w:ascii="Arial" w:hAnsi="Arial" w:eastAsia="宋体"/>
+                <w:b w:val="0"/>
+                <w:sz w:val="19"/>
+              </w:rPr>
+              <w:t>中</w:t>
+            </w:r>
+          </w:p>
+        </w:tc>
+        <w:tc>
+          <w:tcPr>
+            <w:tcW w:type="dxa" w:w="1814"/>
+          </w:tcPr>
+          <w:p>
+            <w:pPr>
+              <w:jc w:val="center"/>
+            </w:pPr>
+            <w:r>
+              <w:rPr>
+                <w:rFonts w:ascii="Arial" w:hAnsi="Arial" w:eastAsia="宋体"/>
+                <w:b w:val="0"/>
+                <w:sz w:val="19"/>
+              </w:rPr>
+              <w:t>中企资讯网(京东通稿转载，二手)</w:t>
+            </w:r>
+          </w:p>
+        </w:tc>
+      </w:tr>
+      <w:tr>
+        <w:tc>
+          <w:tcPr>
+            <w:tcW w:type="dxa" w:w="1247"/>
+            <w:shd w:val="clear" w:fill="F4F6F9"/>
+          </w:tcPr>
+          <w:p>
+            <w:pPr>
+              <w:jc w:val="left"/>
+            </w:pPr>
+            <w:r>
+              <w:rPr>
+                <w:rFonts w:ascii="Arial" w:hAnsi="Arial" w:eastAsia="宋体"/>
+                <w:b w:val="0"/>
+                <w:sz w:val="19"/>
+              </w:rPr>
+              <w:t>2026-08-10</w:t>
+            </w:r>
+          </w:p>
+        </w:tc>
+        <w:tc>
+          <w:tcPr>
+            <w:tcW w:type="dxa" w:w="5386"/>
+            <w:shd w:val="clear" w:fill="F4F6F9"/>
+          </w:tcPr>
+          <w:p>
+            <w:pPr>
+              <w:jc w:val="center"/>
+            </w:pPr>
+            <w:r>
+              <w:rPr>
+                <w:rFonts w:ascii="Arial" w:hAnsi="Arial" w:eastAsia="宋体"/>
+                <w:b w:val="0"/>
+                <w:sz w:val="19"/>
+              </w:rPr>
+              <w:t>微信小店重构家具一级类目：8月24日起『商业办公』改名、部分类目关闭迁移</w:t>
+            </w:r>
+          </w:p>
+        </w:tc>
+        <w:tc>
+          <w:tcPr>
+            <w:tcW w:type="dxa" w:w="737"/>
+            <w:shd w:val="clear" w:fill="F4F6F9"/>
+          </w:tcPr>
+          <w:p>
+            <w:pPr>
+              <w:jc w:val="center"/>
+            </w:pPr>
+            <w:r>
+              <w:rPr>
+                <w:rFonts w:ascii="Arial" w:hAnsi="Arial" w:eastAsia="宋体"/>
+                <w:b w:val="0"/>
+                <w:sz w:val="19"/>
+              </w:rPr>
+              <w:t>中</w:t>
+            </w:r>
+          </w:p>
+        </w:tc>
+        <w:tc>
+          <w:tcPr>
+            <w:tcW w:type="dxa" w:w="1814"/>
+            <w:shd w:val="clear" w:fill="F4F6F9"/>
+          </w:tcPr>
+          <w:p>
+            <w:pPr>
+              <w:jc w:val="center"/>
+            </w:pPr>
+            <w:r>
+              <w:rPr>
+                <w:rFonts w:ascii="Arial" w:hAnsi="Arial" w:eastAsia="宋体"/>
+                <w:b w:val="0"/>
+                <w:sz w:val="19"/>
+              </w:rPr>
+              <w:t>微信小店成长中心·平台公告(腾讯，一手)</w:t>
             </w:r>
           </w:p>
         </w:tc>
@@ -1109,7 +1339,7 @@
           <w:color w:val="333333"/>
           <w:sz w:val="21"/>
         </w:rPr>
-        <w:t>本组共2条，其中高影响0条。平台端呈现『冰火两重天』：京东家装以整装+140%逆势高增、国补第三批625亿续力，是少数结构性亮点；抖音则收紧商家资质合规。天猫应重点关注京东在整装/局改赛道的抢跑，以及国补品类（卫浴/家电）的竞品承接节奏。</w:t>
+        <w:t>本组共4条，其中高影响0条。平台端呈现『冰火两重天』：京东家装以整装+140%逆势高增、国补第三批625亿续力，是少数结构性亮点；抖音则收紧商家资质合规。天猫应重点关注京东在整装/局改赛道的抢跑，以及国补品类（卫浴/家电）的竞品承接节奏。</w:t>
       </w:r>
     </w:p>
     <w:p>
@@ -1123,7 +1353,7 @@
           <w:color w:val="2E5B9A"/>
           <w:sz w:val="27"/>
         </w:rPr>
-        <w:t>1.三　政策标准（3条）</w:t>
+        <w:t>1.三　政策标准（5条）</w:t>
       </w:r>
     </w:p>
     <w:tbl>
@@ -1217,6 +1447,158 @@
                 <w:sz w:val="19"/>
               </w:rPr>
               <w:t>来源</w:t>
+            </w:r>
+          </w:p>
+        </w:tc>
+      </w:tr>
+      <w:tr>
+        <w:tc>
+          <w:tcPr>
+            <w:tcW w:type="dxa" w:w="1247"/>
+          </w:tcPr>
+          <w:p>
+            <w:pPr>
+              <w:jc w:val="left"/>
+            </w:pPr>
+            <w:r>
+              <w:rPr>
+                <w:rFonts w:ascii="Arial" w:hAnsi="Arial" w:eastAsia="宋体"/>
+                <w:b w:val="0"/>
+                <w:sz w:val="19"/>
+              </w:rPr>
+              <w:t>2026-08-10</w:t>
+            </w:r>
+          </w:p>
+        </w:tc>
+        <w:tc>
+          <w:tcPr>
+            <w:tcW w:type="dxa" w:w="5386"/>
+          </w:tcPr>
+          <w:p>
+            <w:pPr>
+              <w:jc w:val="center"/>
+            </w:pPr>
+            <w:r>
+              <w:rPr>
+                <w:rFonts w:ascii="Arial" w:hAnsi="Arial" w:eastAsia="宋体"/>
+                <w:b w:val="0"/>
+                <w:sz w:val="19"/>
+              </w:rPr>
+              <w:t>地方国补白名单滚动扩容：福建三明尤溪已到第十七批，湖北武汉第六批同步公示</w:t>
+            </w:r>
+          </w:p>
+        </w:tc>
+        <w:tc>
+          <w:tcPr>
+            <w:tcW w:type="dxa" w:w="737"/>
+          </w:tcPr>
+          <w:p>
+            <w:pPr>
+              <w:jc w:val="center"/>
+            </w:pPr>
+            <w:r>
+              <w:rPr>
+                <w:rFonts w:ascii="Arial" w:hAnsi="Arial" w:eastAsia="宋体"/>
+                <w:b w:val="0"/>
+                <w:sz w:val="19"/>
+              </w:rPr>
+              <w:t>中</w:t>
+            </w:r>
+          </w:p>
+        </w:tc>
+        <w:tc>
+          <w:tcPr>
+            <w:tcW w:type="dxa" w:w="1814"/>
+          </w:tcPr>
+          <w:p>
+            <w:pPr>
+              <w:jc w:val="center"/>
+            </w:pPr>
+            <w:r>
+              <w:rPr>
+                <w:rFonts w:ascii="Arial" w:hAnsi="Arial" w:eastAsia="宋体"/>
+                <w:b w:val="0"/>
+                <w:sz w:val="19"/>
+              </w:rPr>
+              <w:t>尤溪县/武汉市商务局(一手)</w:t>
+            </w:r>
+          </w:p>
+        </w:tc>
+      </w:tr>
+      <w:tr>
+        <w:tc>
+          <w:tcPr>
+            <w:tcW w:type="dxa" w:w="1247"/>
+            <w:shd w:val="clear" w:fill="F4F6F9"/>
+          </w:tcPr>
+          <w:p>
+            <w:pPr>
+              <w:jc w:val="left"/>
+            </w:pPr>
+            <w:r>
+              <w:rPr>
+                <w:rFonts w:ascii="Arial" w:hAnsi="Arial" w:eastAsia="宋体"/>
+                <w:b w:val="0"/>
+                <w:sz w:val="19"/>
+              </w:rPr>
+              <w:t>2026-07-28</w:t>
+            </w:r>
+          </w:p>
+        </w:tc>
+        <w:tc>
+          <w:tcPr>
+            <w:tcW w:type="dxa" w:w="5386"/>
+            <w:shd w:val="clear" w:fill="F4F6F9"/>
+          </w:tcPr>
+          <w:p>
+            <w:pPr>
+              <w:jc w:val="center"/>
+            </w:pPr>
+            <w:r>
+              <w:rPr>
+                <w:rFonts w:ascii="Arial" w:hAnsi="Arial" w:eastAsia="宋体"/>
+                <w:b w:val="0"/>
+                <w:sz w:val="19"/>
+              </w:rPr>
+              <w:t>南平细化智能家居补贴口径：新增油烟机/洗碗机等5类，『智能沙发』并入按摩椅不得重复申领</w:t>
+            </w:r>
+          </w:p>
+        </w:tc>
+        <w:tc>
+          <w:tcPr>
+            <w:tcW w:type="dxa" w:w="737"/>
+            <w:shd w:val="clear" w:fill="F4F6F9"/>
+          </w:tcPr>
+          <w:p>
+            <w:pPr>
+              <w:jc w:val="center"/>
+            </w:pPr>
+            <w:r>
+              <w:rPr>
+                <w:rFonts w:ascii="Arial" w:hAnsi="Arial" w:eastAsia="宋体"/>
+                <w:b w:val="0"/>
+                <w:sz w:val="19"/>
+              </w:rPr>
+              <w:t>中</w:t>
+            </w:r>
+          </w:p>
+        </w:tc>
+        <w:tc>
+          <w:tcPr>
+            <w:tcW w:type="dxa" w:w="1814"/>
+            <w:shd w:val="clear" w:fill="F4F6F9"/>
+          </w:tcPr>
+          <w:p>
+            <w:pPr>
+              <w:jc w:val="center"/>
+            </w:pPr>
+            <w:r>
+              <w:rPr>
+                <w:rFonts w:ascii="Arial" w:hAnsi="Arial" w:eastAsia="宋体"/>
+                <w:b w:val="0"/>
+                <w:sz w:val="19"/>
+              </w:rPr>
+              <w:t>福建省发改委(转南平市商务局公告，一手)</w:t>
             </w:r>
           </w:p>
         </w:tc>
@@ -1469,7 +1851,7 @@
           <w:color w:val="333333"/>
           <w:sz w:val="21"/>
         </w:rPr>
-        <w:t>本组共3条，其中高影响1条。政策端标准与国补双轮驱动：智能卫浴可靠性国标、住宅全案整装服务标准、508项国标同步推高质量与合规门槛，利好研发/服务投入高的头部品牌、加速中小出清；北京(07-23)、福建(07-22)地方国补密集扩围，首次将智能马桶/智能床/智能沙发等智能睡眠与软体家具纳入补贴，示范效应向全国传导。天猫招商与流量分配应向合规头部倾斜，并用足国补新增品类的流量红利。</w:t>
+        <w:t>本组共5条，其中高影响1条。政策端标准与国补双轮驱动：智能卫浴可靠性国标、住宅全案整装服务标准、508项国标同步推高质量与合规门槛，利好研发/服务投入高的头部品牌、加速中小出清；北京(07-23)、福建(07-22)地方国补密集扩围，首次将智能马桶/智能床/智能沙发等智能睡眠与软体家具纳入补贴，示范效应向全国传导。天猫招商与流量分配应向合规头部倾斜，并用足国补新增品类的流量红利。</w:t>
       </w:r>
     </w:p>
     <w:p>
@@ -1483,7 +1865,7 @@
           <w:color w:val="2E5B9A"/>
           <w:sz w:val="27"/>
         </w:rPr>
-        <w:t>1.四　头部商家（6条）</w:t>
+        <w:t>1.四　头部商家（8条）</w:t>
       </w:r>
     </w:p>
     <w:tbl>
@@ -1577,6 +1959,158 @@
                 <w:sz w:val="19"/>
               </w:rPr>
               <w:t>来源</w:t>
+            </w:r>
+          </w:p>
+        </w:tc>
+      </w:tr>
+      <w:tr>
+        <w:tc>
+          <w:tcPr>
+            <w:tcW w:type="dxa" w:w="1247"/>
+          </w:tcPr>
+          <w:p>
+            <w:pPr>
+              <w:jc w:val="left"/>
+            </w:pPr>
+            <w:r>
+              <w:rPr>
+                <w:rFonts w:ascii="Arial" w:hAnsi="Arial" w:eastAsia="宋体"/>
+                <w:b w:val="0"/>
+                <w:sz w:val="19"/>
+              </w:rPr>
+              <w:t>2026-08-13</w:t>
+            </w:r>
+          </w:p>
+        </w:tc>
+        <w:tc>
+          <w:tcPr>
+            <w:tcW w:type="dxa" w:w="5386"/>
+          </w:tcPr>
+          <w:p>
+            <w:pPr>
+              <w:jc w:val="center"/>
+            </w:pPr>
+            <w:r>
+              <w:rPr>
+                <w:rFonts w:ascii="Arial" w:hAnsi="Arial" w:eastAsia="宋体"/>
+                <w:b w:val="0"/>
+                <w:sz w:val="19"/>
+              </w:rPr>
+              <w:t>曲美家居把抖音自播带货费率打到平台下限5%：实控人二代『泽龙Z』12个月带货32.44万</w:t>
+            </w:r>
+          </w:p>
+        </w:tc>
+        <w:tc>
+          <w:tcPr>
+            <w:tcW w:type="dxa" w:w="737"/>
+          </w:tcPr>
+          <w:p>
+            <w:pPr>
+              <w:jc w:val="center"/>
+            </w:pPr>
+            <w:r>
+              <w:rPr>
+                <w:rFonts w:ascii="Arial" w:hAnsi="Arial" w:eastAsia="宋体"/>
+                <w:b w:val="0"/>
+                <w:sz w:val="19"/>
+              </w:rPr>
+              <w:t>高</w:t>
+            </w:r>
+          </w:p>
+        </w:tc>
+        <w:tc>
+          <w:tcPr>
+            <w:tcW w:type="dxa" w:w="1814"/>
+          </w:tcPr>
+          <w:p>
+            <w:pPr>
+              <w:jc w:val="center"/>
+            </w:pPr>
+            <w:r>
+              <w:rPr>
+                <w:rFonts w:ascii="Arial" w:hAnsi="Arial" w:eastAsia="宋体"/>
+                <w:b w:val="0"/>
+                <w:sz w:val="19"/>
+              </w:rPr>
+              <w:t>上交所/东方财富·曲美家居2026-036号公告(逐字核验)</w:t>
+            </w:r>
+          </w:p>
+        </w:tc>
+      </w:tr>
+      <w:tr>
+        <w:tc>
+          <w:tcPr>
+            <w:tcW w:type="dxa" w:w="1247"/>
+            <w:shd w:val="clear" w:fill="F4F6F9"/>
+          </w:tcPr>
+          <w:p>
+            <w:pPr>
+              <w:jc w:val="left"/>
+            </w:pPr>
+            <w:r>
+              <w:rPr>
+                <w:rFonts w:ascii="Arial" w:hAnsi="Arial" w:eastAsia="宋体"/>
+                <w:b w:val="0"/>
+                <w:sz w:val="19"/>
+              </w:rPr>
+              <w:t>2026-08-13</w:t>
+            </w:r>
+          </w:p>
+        </w:tc>
+        <w:tc>
+          <w:tcPr>
+            <w:tcW w:type="dxa" w:w="5386"/>
+            <w:shd w:val="clear" w:fill="F4F6F9"/>
+          </w:tcPr>
+          <w:p>
+            <w:pPr>
+              <w:jc w:val="center"/>
+            </w:pPr>
+            <w:r>
+              <w:rPr>
+                <w:rFonts w:ascii="Arial" w:hAnsi="Arial" w:eastAsia="宋体"/>
+                <w:b w:val="0"/>
+                <w:sz w:val="19"/>
+              </w:rPr>
+              <w:t>江河集团H1净利+34%叠加中期分红预期，三日累涨超20%触发异动核查</w:t>
+            </w:r>
+          </w:p>
+        </w:tc>
+        <w:tc>
+          <w:tcPr>
+            <w:tcW w:type="dxa" w:w="737"/>
+            <w:shd w:val="clear" w:fill="F4F6F9"/>
+          </w:tcPr>
+          <w:p>
+            <w:pPr>
+              <w:jc w:val="center"/>
+            </w:pPr>
+            <w:r>
+              <w:rPr>
+                <w:rFonts w:ascii="Arial" w:hAnsi="Arial" w:eastAsia="宋体"/>
+                <w:b w:val="0"/>
+                <w:sz w:val="19"/>
+              </w:rPr>
+              <w:t>中</w:t>
+            </w:r>
+          </w:p>
+        </w:tc>
+        <w:tc>
+          <w:tcPr>
+            <w:tcW w:type="dxa" w:w="1814"/>
+            <w:shd w:val="clear" w:fill="F4F6F9"/>
+          </w:tcPr>
+          <w:p>
+            <w:pPr>
+              <w:jc w:val="center"/>
+            </w:pPr>
+            <w:r>
+              <w:rPr>
+                <w:rFonts w:ascii="Arial" w:hAnsi="Arial" w:eastAsia="宋体"/>
+                <w:b w:val="0"/>
+                <w:sz w:val="19"/>
+              </w:rPr>
+              <w:t>上交所/东方财富·江河集团临2026-037号公告(逐字核验)</w:t>
             </w:r>
           </w:p>
         </w:tc>
@@ -2059,7 +2593,7 @@
           <w:color w:val="333333"/>
           <w:sz w:val="21"/>
         </w:rPr>
-        <w:t>本组共6条，其中高影响2条。H1业绩预告披露季头部集体探底：定制家居（欧派预降50-60%、志邦转亏、索菲亚预降78-85%）、软体（慕思预降44-51%）、卫浴（箭牌转亏、惠达预亏）、瓷砖（东鹏净利降85-88%）、板材（大亚圣象预亏）全品类承压；但蒙娜丽莎扭亏、红星美凯龙扭亏、三棵树零售涂料韧性、东鹏逆势净增门店50家显示『收缩工程/做强零售』自救路径见效。运营需警惕定制/软体赛道承压对天猫GMV的传导，同时关注做强零售的头部品牌合作机会。</w:t>
+        <w:t>本组共8条，其中高影响3条。H1业绩预告披露季头部集体探底：定制家居（欧派预降50-60%、志邦转亏、索菲亚预降78-85%）、软体（慕思预降44-51%）、卫浴（箭牌转亏、惠达预亏）、瓷砖（东鹏净利降85-88%）、板材（大亚圣象预亏）全品类承压；但蒙娜丽莎扭亏、红星美凯龙扭亏、三棵树零售涂料韧性、东鹏逆势净增门店50家显示『收缩工程/做强零售』自救路径见效。运营需警惕定制/软体赛道承压对天猫GMV的传导，同时关注做强零售的头部品牌合作机会。</w:t>
       </w:r>
     </w:p>
     <w:p>
@@ -3781,7 +4315,7 @@
           <w:b w:val="0"/>
           <w:sz w:val="22"/>
         </w:rPr>
-        <w:t>数据来源：抖店罗盘·类目概览（https://compass.jinritemai.com/shop/chance/category-overview），经陪跑扫码登录后浏览器自动化抽取，采集时间 2026-07-30 16:17 CST。【数据日期提示】本区块为2026-07-30经夸克浏览器现采的近7天(2026/07/23-07/29)数据。抖店罗盘对市场类目只公开数量级区间（如 ¥1亿-¥1.5亿），不显示精确值；文中区间原样保留。较上周期百分比为口径公开的精确 WoW。</w:t>
+        <w:t>数据来源：抖店罗盘·类目概览（https://compass.jinritemai.com/shop/chance/category-overview），经陪跑扫码登录后浏览器自动化抽取，采集时间 2026-08-13 11:40 CST。【数据日期提示】本区块为2026-08-13经Chrome浏览器现采的近7天(2026/08/06-08/12)数据。抖店罗盘对市场类目只公开数量级区间（如 ¥1亿-¥1.5亿），不显示精确值；文中区间原样保留。较上周期百分比为口径公开的精确 WoW，涨跌符号已按 DOM 趋势类名校验。</w:t>
       </w:r>
     </w:p>
     <w:p>
@@ -3905,7 +4439,7 @@
                 <w:b w:val="0"/>
                 <w:sz w:val="19"/>
               </w:rPr>
-              <w:t>¥4.5亿 - ¥5亿</w:t>
+              <w:t>¥5亿 - ¥5.5亿</w:t>
             </w:r>
           </w:p>
         </w:tc>
@@ -3923,7 +4457,7 @@
                 <w:b w:val="0"/>
                 <w:sz w:val="19"/>
               </w:rPr>
-              <w:t>+1.12%</w:t>
+              <w:t>+1.81%</w:t>
             </w:r>
           </w:p>
         </w:tc>
@@ -3963,7 +4497,7 @@
                 <w:b w:val="0"/>
                 <w:sz w:val="19"/>
               </w:rPr>
-              <w:t>750万 - 1,000万</w:t>
+              <w:t>1,000万 - 2,500万</w:t>
             </w:r>
           </w:p>
         </w:tc>
@@ -3982,7 +4516,7 @@
                 <w:b w:val="0"/>
                 <w:sz w:val="19"/>
               </w:rPr>
-              <w:t>+0.57%</w:t>
+              <w:t>+4.38%</w:t>
             </w:r>
           </w:p>
         </w:tc>
@@ -4038,7 +4572,7 @@
                 <w:b w:val="0"/>
                 <w:sz w:val="19"/>
               </w:rPr>
-              <w:t>+5.52%</w:t>
+              <w:t>-0.06%</w:t>
             </w:r>
           </w:p>
         </w:tc>
@@ -4097,7 +4631,7 @@
                 <w:b w:val="0"/>
                 <w:sz w:val="19"/>
               </w:rPr>
-              <w:t>-0.85%</w:t>
+              <w:t>+4.98%</w:t>
             </w:r>
           </w:p>
         </w:tc>
@@ -4153,7 +4687,7 @@
                 <w:b w:val="0"/>
                 <w:sz w:val="19"/>
               </w:rPr>
-              <w:t>+0.37%</w:t>
+              <w:t>+0.51%</w:t>
             </w:r>
           </w:p>
         </w:tc>
@@ -4212,7 +4746,7 @@
                 <w:b w:val="0"/>
                 <w:sz w:val="19"/>
               </w:rPr>
-              <w:t>-0.77%</w:t>
+              <w:t>+1.25%</w:t>
             </w:r>
           </w:p>
         </w:tc>
@@ -4268,7 +4802,7 @@
                 <w:b w:val="0"/>
                 <w:sz w:val="19"/>
               </w:rPr>
-              <w:t>+1.70%</w:t>
+              <w:t>-2.46%</w:t>
             </w:r>
           </w:p>
         </w:tc>
@@ -4327,7 +4861,7 @@
                 <w:b w:val="0"/>
                 <w:sz w:val="19"/>
               </w:rPr>
-              <w:t>-4.17%</w:t>
+              <w:t>+1.87%</w:t>
             </w:r>
           </w:p>
         </w:tc>
@@ -4969,7 +5503,7 @@
                 <w:b w:val="0"/>
                 <w:sz w:val="19"/>
               </w:rPr>
-              <w:t>¥100-¥200</w:t>
+              <w:t>¥50-¥100</w:t>
             </w:r>
           </w:p>
         </w:tc>
@@ -5007,7 +5541,7 @@
                 <w:b w:val="0"/>
                 <w:sz w:val="19"/>
               </w:rPr>
-              <w:t>胶粘剂</w:t>
+              <w:t>防护材料</w:t>
             </w:r>
           </w:p>
         </w:tc>
@@ -5043,7 +5577,7 @@
                 <w:b w:val="0"/>
                 <w:sz w:val="19"/>
               </w:rPr>
-              <w:t>5%-7.5%</w:t>
+              <w:t>2.5%-5%</w:t>
             </w:r>
           </w:p>
         </w:tc>
@@ -5119,7 +5653,7 @@
                 <w:b w:val="0"/>
                 <w:sz w:val="19"/>
               </w:rPr>
-              <w:t>防护材料</w:t>
+              <w:t>胶粘剂</w:t>
             </w:r>
           </w:p>
         </w:tc>
@@ -5513,7 +6047,7 @@
                 <w:b w:val="0"/>
                 <w:sz w:val="19"/>
               </w:rPr>
-              <w:t>¥10-¥50</w:t>
+              <w:t>¥50-¥100</w:t>
             </w:r>
           </w:p>
         </w:tc>
@@ -5571,7 +6105,7 @@
                 <w:b w:val="0"/>
                 <w:sz w:val="19"/>
               </w:rPr>
-              <w:t>门及配件</w:t>
+              <w:t>墙面材料</w:t>
             </w:r>
           </w:p>
         </w:tc>
@@ -5609,7 +6143,7 @@
                 <w:b w:val="0"/>
                 <w:sz w:val="19"/>
               </w:rPr>
-              <w:t>1%-2.5%</w:t>
+              <w:t>2.5%-5%</w:t>
             </w:r>
           </w:p>
         </w:tc>
@@ -5647,7 +6181,7 @@
                 <w:b w:val="0"/>
                 <w:sz w:val="19"/>
               </w:rPr>
-              <w:t>¥50-¥100</w:t>
+              <w:t>¥10-¥50</w:t>
             </w:r>
           </w:p>
         </w:tc>
@@ -5685,7 +6219,7 @@
                 <w:b w:val="0"/>
                 <w:sz w:val="19"/>
               </w:rPr>
-              <w:t>墙面材料</w:t>
+              <w:t>门及配件</w:t>
             </w:r>
           </w:p>
         </w:tc>
@@ -5721,7 +6255,7 @@
                 <w:b w:val="0"/>
                 <w:sz w:val="19"/>
               </w:rPr>
-              <w:t>1%-2.5%</w:t>
+              <w:t>2.5%-5%</w:t>
             </w:r>
           </w:p>
         </w:tc>
@@ -5739,7 +6273,7 @@
                 <w:b w:val="0"/>
                 <w:sz w:val="19"/>
               </w:rPr>
-              <w:t>¥10-¥50</w:t>
+              <w:t>¥50-¥100</w:t>
             </w:r>
           </w:p>
         </w:tc>
@@ -5816,7 +6350,7 @@
                 <w:b w:val="0"/>
                 <w:sz w:val="19"/>
               </w:rPr>
-              <w:t>¥750万-¥1,000万</w:t>
+              <w:t>¥1,000万-¥2,500万</w:t>
             </w:r>
           </w:p>
         </w:tc>
@@ -6564,7 +7098,7 @@
                 <w:b w:val="0"/>
                 <w:sz w:val="19"/>
               </w:rPr>
-              <w:t>54.9%</w:t>
+              <w:t>54.39%</w:t>
             </w:r>
           </w:p>
         </w:tc>
@@ -6603,7 +7137,7 @@
                 <w:b w:val="0"/>
                 <w:sz w:val="19"/>
               </w:rPr>
-              <w:t>商品卡</w:t>
+              <w:t>短视频</w:t>
             </w:r>
           </w:p>
         </w:tc>
@@ -6622,7 +7156,7 @@
                 <w:b w:val="0"/>
                 <w:sz w:val="19"/>
               </w:rPr>
-              <w:t>21.76%</w:t>
+              <w:t>20.86%</w:t>
             </w:r>
           </w:p>
         </w:tc>
@@ -6661,7 +7195,7 @@
                 <w:b w:val="0"/>
                 <w:sz w:val="19"/>
               </w:rPr>
-              <w:t>短视频</w:t>
+              <w:t>商品卡</w:t>
             </w:r>
           </w:p>
         </w:tc>
@@ -6679,7 +7213,7 @@
                 <w:b w:val="0"/>
                 <w:sz w:val="19"/>
               </w:rPr>
-              <w:t>19.47%</w:t>
+              <w:t>20.49%</w:t>
             </w:r>
           </w:p>
         </w:tc>
@@ -6697,7 +7231,7 @@
                 <w:b w:val="0"/>
                 <w:sz w:val="19"/>
               </w:rPr>
-              <w:t>¥7,500万-¥1亿</w:t>
+              <w:t>¥1亿-¥1.5亿</w:t>
             </w:r>
           </w:p>
         </w:tc>
@@ -6737,7 +7271,7 @@
                 <w:b w:val="0"/>
                 <w:sz w:val="19"/>
               </w:rPr>
-              <w:t>3.79%</w:t>
+              <w:t>4.17%</w:t>
             </w:r>
           </w:p>
         </w:tc>
@@ -6794,7 +7328,7 @@
                 <w:b w:val="0"/>
                 <w:sz w:val="19"/>
               </w:rPr>
-              <w:t>0.08%</w:t>
+              <w:t>0.1%</w:t>
             </w:r>
           </w:p>
         </w:tc>
@@ -6880,7 +7414,7 @@
           <w:rFonts w:ascii="Arial" w:hAnsi="Arial" w:eastAsia="宋体"/>
           <w:sz w:val="21"/>
         </w:rPr>
-        <w:t>• 抖音家装建材大盘 7/9-7/15 GMV ¥4.5-5亿，环比+1.5%；订单+7%、买家+4.9%，说明客单价（¥50-100 区间上端）在拉动，非纯流量红利。</w:t>
+        <w:t>• 抖音家装建材大盘 8/6-8/12 GMV ¥5-5.5亿，WoW +1.81%；订单+4.98%、件数+4.38%，但买家几乎持平(-0.06%)——本周增长由老客/多件购买驱动而非拉新；件单价-2.46%(¥10-50)、客单价+1.87%(¥50-100)：单件更便宜、每单买得更多，818预热期'凑单囤货'特征明显。</w:t>
       </w:r>
     </w:p>
     <w:p>
@@ -6893,7 +7427,7 @@
           <w:rFonts w:ascii="Arial" w:hAnsi="Arial" w:eastAsia="宋体"/>
           <w:sz w:val="21"/>
         </w:rPr>
-        <w:t>• TOP2 子类目 全屋智能(25-30%) + 卫浴建材(20-25%) 合计 ~50% 大盘，注意全屋智能件单价¥200-300 vs 卫浴建材¥100-200：智能硬件在抖音已进入高价心智，卫浴走走量。</w:t>
+        <w:t>• TOP2 子类目 全屋智能(25-30%) + 卫浴建材(20-25%) 合计约 50% 大盘；全屋智能件单价¥200-300/客单价¥300-400 显著高于卫浴建材(¥100-200)，智能硬件在抖音的高价心智延续，卫浴走量。</w:t>
       </w:r>
     </w:p>
     <w:p>
@@ -6906,7 +7440,7 @@
           <w:rFonts w:ascii="Arial" w:hAnsi="Arial" w:eastAsia="宋体"/>
           <w:sz w:val="21"/>
         </w:rPr>
-        <w:t>• 价格带极度头重脚轻：¥39以上占 75-80% GMV，说明抖音家装建材不再是低价白牌天下，中高端已跑起来。</w:t>
+        <w:t>• 价格带极度头重脚轻：¥39以上占 75-80% GMV(¥3.5-4亿)，19-39仅10-15%、0-6元仅1-2.5%——中高端仍是抖音家装建材主战场，低价白牌不是大盘主力。</w:t>
       </w:r>
     </w:p>
     <w:p>
@@ -6919,7 +7453,7 @@
           <w:rFonts w:ascii="Arial" w:hAnsi="Arial" w:eastAsia="宋体"/>
           <w:sz w:val="21"/>
         </w:rPr>
-        <w:t>• 载体：直播 54.8% + 商品卡 21.87% + 短视频 19.7% = 96.4%，图文仅 0.1%——图文种草模型在这个类目失效，直播和货架是主战场。</w:t>
+        <w:t>• 载体：直播 54.39% + 短视频 20.86% + 商品卡 20.49% = 95.7%，图文仅 0.1%——直播与货架双主场，图文种草在此类目基本失效。</w:t>
       </w:r>
     </w:p>
     <w:p>
@@ -6932,7 +7466,7 @@
           <w:rFonts w:ascii="Arial" w:hAnsi="Arial" w:eastAsia="宋体"/>
           <w:sz w:val="21"/>
         </w:rPr>
-        <w:t>• 渠道 TOP3：短视频引流(25-30%) + 直播推荐(20-25%) + 搜索(15-20%) = 60-70% GMV，搜索占比不低，说明用户"抖音搜家装"心智已成型。</w:t>
+        <w:t>• 渠道 TOP3：短视频引流(25-30%) + 直播推荐(20-25%) + 搜索(15-20%) = 60-70% GMV，搜索占比可观，'抖音搜家装'心智稳固。</w:t>
       </w:r>
     </w:p>
     <w:p>
@@ -6945,7 +7479,7 @@
           <w:rFonts w:ascii="Arial" w:hAnsi="Arial" w:eastAsia="宋体"/>
           <w:sz w:val="21"/>
         </w:rPr>
-        <w:t>• TOP15 单品中，智能锁 4 席（掌静脉/掌静脉/双子星/联想T30pro）、监控摄像头 4 席（步猎鹰/神眸/斯麦特/AUX），共 8 席，与用户跟的 AI 锁/AI 监控摄像头 2 大赛道高度重叠——这些品牌应立即加入天猫竞品追踪清单。</w:t>
+        <w:t>• TOP15 单品：监控摄像头 5 席（萤石魔方Pro/步猎鹰/Philips/AUX/神眸）、智能锁 3 席（掌静脉/联想T30pro/因硕R8）、智能马桶 2 席（东沃D6D/蓝宝T9），AI安防+智能卫浴是818前确定性爆发赛道；欧派木门(第10)首次进 TOP10，传统家居品牌在抖音高价带开始起量，应纳入天猫竞品追踪。</w:t>
       </w:r>
     </w:p>
     <w:p>
@@ -6992,7 +7526,7 @@
           <w:color w:val="2E5B9A"/>
           <w:sz w:val="27"/>
         </w:rPr>
-        <w:t>4.1　京东（7条）</w:t>
+        <w:t>4.1　京东（9条）</w:t>
       </w:r>
     </w:p>
     <w:tbl>
@@ -7065,6 +7599,121 @@
                 <w:sz w:val="18"/>
               </w:rPr>
               <w:t>子行业</w:t>
+            </w:r>
+          </w:p>
+        </w:tc>
+      </w:tr>
+      <w:tr>
+        <w:tc>
+          <w:tcPr>
+            <w:tcW w:type="dxa" w:w="1247"/>
+          </w:tcPr>
+          <w:p>
+            <w:pPr>
+              <w:jc w:val="left"/>
+            </w:pPr>
+            <w:r>
+              <w:rPr>
+                <w:rFonts w:ascii="Arial" w:hAnsi="Arial" w:eastAsia="宋体"/>
+                <w:b w:val="0"/>
+                <w:sz w:val="18"/>
+              </w:rPr>
+              <w:t>2026-08-11</w:t>
+            </w:r>
+          </w:p>
+        </w:tc>
+        <w:tc>
+          <w:tcPr>
+            <w:tcW w:type="dxa" w:w="5953"/>
+          </w:tcPr>
+          <w:p>
+            <w:pPr>
+              <w:jc w:val="center"/>
+            </w:pPr>
+            <w:r>
+              <w:rPr>
+                <w:rFonts w:ascii="Arial" w:hAnsi="Arial" w:eastAsia="宋体"/>
+                <w:b w:val="0"/>
+                <w:sz w:val="18"/>
+              </w:rPr>
+              <w:t>京东家具超级品类日携手马頔办『新家发补会』：亿元家装补贴、至高返50%、每晚8点</w:t>
+            </w:r>
+          </w:p>
+        </w:tc>
+        <w:tc>
+          <w:tcPr>
+            <w:tcW w:type="dxa" w:w="1417"/>
+          </w:tcPr>
+          <w:p>
+            <w:pPr>
+              <w:jc w:val="center"/>
+            </w:pPr>
+            <w:r>
+              <w:rPr>
+                <w:rFonts w:ascii="Arial" w:hAnsi="Arial" w:eastAsia="宋体"/>
+                <w:b w:val="0"/>
+                <w:sz w:val="18"/>
+              </w:rPr>
+              <w:t>软体家具</w:t>
+            </w:r>
+          </w:p>
+        </w:tc>
+      </w:tr>
+      <w:tr>
+        <w:tc>
+          <w:tcPr>
+            <w:tcW w:type="dxa" w:w="1247"/>
+            <w:shd w:val="clear" w:fill="F4F6F9"/>
+          </w:tcPr>
+          <w:p>
+            <w:pPr>
+              <w:jc w:val="left"/>
+            </w:pPr>
+            <w:r>
+              <w:rPr>
+                <w:rFonts w:ascii="Arial" w:hAnsi="Arial" w:eastAsia="宋体"/>
+                <w:b w:val="0"/>
+                <w:sz w:val="18"/>
+              </w:rPr>
+              <w:t>2026-08-05</w:t>
+            </w:r>
+          </w:p>
+        </w:tc>
+        <w:tc>
+          <w:tcPr>
+            <w:tcW w:type="dxa" w:w="5953"/>
+            <w:shd w:val="clear" w:fill="F4F6F9"/>
+          </w:tcPr>
+          <w:p>
+            <w:pPr>
+              <w:jc w:val="center"/>
+            </w:pPr>
+            <w:r>
+              <w:rPr>
+                <w:rFonts w:ascii="Arial" w:hAnsi="Arial" w:eastAsia="宋体"/>
+                <w:b w:val="0"/>
+                <w:sz w:val="18"/>
+              </w:rPr>
+              <w:t>京东自营家装清凉季主打『政企双补·至高立减15%』，多地拓宽公积金支持装修</w:t>
+            </w:r>
+          </w:p>
+        </w:tc>
+        <w:tc>
+          <w:tcPr>
+            <w:tcW w:type="dxa" w:w="1417"/>
+            <w:shd w:val="clear" w:fill="F4F6F9"/>
+          </w:tcPr>
+          <w:p>
+            <w:pPr>
+              <w:jc w:val="center"/>
+            </w:pPr>
+            <w:r>
+              <w:rPr>
+                <w:rFonts w:ascii="Arial" w:hAnsi="Arial" w:eastAsia="宋体"/>
+                <w:b w:val="0"/>
+                <w:sz w:val="18"/>
+              </w:rPr>
+              <w:t>定制家居</w:t>
             </w:r>
           </w:p>
         </w:tc>
@@ -7662,6 +8311,344 @@
           <w:sz w:val="21"/>
         </w:rPr>
         <w:t>抖音端一面是618家居家装战报（喜临门床垫13.5亿、九牧卫浴榜首、爱果乐多榜TOP1），一面是收紧商家资质合规。内容电商仍是家居品牌种草与直播成交的核心增量场，天猫需关注品牌预算向抖音的分流。</w:t>
+      </w:r>
+    </w:p>
+    <w:p>
+      <w:pPr>
+        <w:pStyle w:val="Heading2"/>
+      </w:pPr>
+      <w:r>
+        <w:rPr>
+          <w:rFonts w:ascii="Arial" w:hAnsi="Arial" w:eastAsia="微软雅黑"/>
+          <w:b/>
+          <w:color w:val="2E5B9A"/>
+          <w:sz w:val="27"/>
+        </w:rPr>
+        <w:t>4.6　视频号（1条）</w:t>
+      </w:r>
+    </w:p>
+    <w:tbl>
+      <w:tblPr>
+        <w:tblStyle w:val="TableGrid"/>
+        <w:tblW w:type="auto" w:w="0"/>
+        <w:jc w:val="center"/>
+        <w:tblLook w:firstColumn="1" w:firstRow="1" w:lastColumn="0" w:lastRow="0" w:noHBand="0" w:noVBand="1" w:val="04A0"/>
+      </w:tblPr>
+      <w:tblGrid>
+        <w:gridCol w:w="3249"/>
+        <w:gridCol w:w="3249"/>
+        <w:gridCol w:w="3249"/>
+      </w:tblGrid>
+      <w:tr>
+        <w:tc>
+          <w:tcPr>
+            <w:tcW w:type="dxa" w:w="1247"/>
+            <w:shd w:val="clear" w:fill="1F3864"/>
+          </w:tcPr>
+          <w:p>
+            <w:pPr>
+              <w:jc w:val="center"/>
+            </w:pPr>
+            <w:r>
+              <w:rPr>
+                <w:rFonts w:ascii="Arial" w:hAnsi="Arial" w:eastAsia="微软雅黑"/>
+                <w:b/>
+                <w:color w:val="FFFFFF"/>
+                <w:sz w:val="18"/>
+              </w:rPr>
+              <w:t>日期</w:t>
+            </w:r>
+          </w:p>
+        </w:tc>
+        <w:tc>
+          <w:tcPr>
+            <w:tcW w:type="dxa" w:w="5953"/>
+            <w:shd w:val="clear" w:fill="1F3864"/>
+          </w:tcPr>
+          <w:p>
+            <w:pPr>
+              <w:jc w:val="center"/>
+            </w:pPr>
+            <w:r>
+              <w:rPr>
+                <w:rFonts w:ascii="Arial" w:hAnsi="Arial" w:eastAsia="微软雅黑"/>
+                <w:b/>
+                <w:color w:val="FFFFFF"/>
+                <w:sz w:val="18"/>
+              </w:rPr>
+              <w:t>动态标题</w:t>
+            </w:r>
+          </w:p>
+        </w:tc>
+        <w:tc>
+          <w:tcPr>
+            <w:tcW w:type="dxa" w:w="1417"/>
+            <w:shd w:val="clear" w:fill="1F3864"/>
+          </w:tcPr>
+          <w:p>
+            <w:pPr>
+              <w:jc w:val="center"/>
+            </w:pPr>
+            <w:r>
+              <w:rPr>
+                <w:rFonts w:ascii="Arial" w:hAnsi="Arial" w:eastAsia="微软雅黑"/>
+                <w:b/>
+                <w:color w:val="FFFFFF"/>
+                <w:sz w:val="18"/>
+              </w:rPr>
+              <w:t>子行业</w:t>
+            </w:r>
+          </w:p>
+        </w:tc>
+      </w:tr>
+      <w:tr>
+        <w:tc>
+          <w:tcPr>
+            <w:tcW w:type="dxa" w:w="1247"/>
+          </w:tcPr>
+          <w:p>
+            <w:pPr>
+              <w:jc w:val="left"/>
+            </w:pPr>
+            <w:r>
+              <w:rPr>
+                <w:rFonts w:ascii="Arial" w:hAnsi="Arial" w:eastAsia="宋体"/>
+                <w:b w:val="0"/>
+                <w:sz w:val="18"/>
+              </w:rPr>
+              <w:t>2026-08-10</w:t>
+            </w:r>
+          </w:p>
+        </w:tc>
+        <w:tc>
+          <w:tcPr>
+            <w:tcW w:type="dxa" w:w="5953"/>
+          </w:tcPr>
+          <w:p>
+            <w:pPr>
+              <w:jc w:val="center"/>
+            </w:pPr>
+            <w:r>
+              <w:rPr>
+                <w:rFonts w:ascii="Arial" w:hAnsi="Arial" w:eastAsia="宋体"/>
+                <w:b w:val="0"/>
+                <w:sz w:val="18"/>
+              </w:rPr>
+              <w:t>微信小店一级类目【家具】调整：8月24日起类目更名/新增/关闭，二级『商业办公』</w:t>
+            </w:r>
+          </w:p>
+        </w:tc>
+        <w:tc>
+          <w:tcPr>
+            <w:tcW w:type="dxa" w:w="1417"/>
+          </w:tcPr>
+          <w:p>
+            <w:pPr>
+              <w:jc w:val="center"/>
+            </w:pPr>
+            <w:r>
+              <w:rPr>
+                <w:rFonts w:ascii="Arial" w:hAnsi="Arial" w:eastAsia="宋体"/>
+                <w:b w:val="0"/>
+                <w:sz w:val="18"/>
+              </w:rPr>
+              <w:t>家具</w:t>
+            </w:r>
+          </w:p>
+        </w:tc>
+      </w:tr>
+    </w:tbl>
+    <w:p>
+      <w:pPr>
+        <w:spacing w:line="360" w:lineRule="auto" w:before="60"/>
+        <w:ind w:firstLine="440"/>
+        <w:shd w:val="clear" w:fill="F2F6FB"/>
+      </w:pPr>
+      <w:r>
+        <w:rPr>
+          <w:rFonts w:ascii="Arial" w:hAnsi="Arial" w:eastAsia="微软雅黑"/>
+          <w:b/>
+          <w:color w:val="2E5B9A"/>
+          <w:sz w:val="21"/>
+        </w:rPr>
+        <w:t>解读：</w:t>
+      </w:r>
+      <w:r>
+        <w:rPr>
+          <w:rFonts w:ascii="Arial" w:hAnsi="Arial" w:eastAsia="宋体"/>
+          <w:color w:val="333333"/>
+          <w:sz w:val="21"/>
+        </w:rPr>
+        <w:t>本平台在窗口期内有公开动态，详见上表来源链接。</w:t>
+      </w:r>
+    </w:p>
+    <w:p>
+      <w:pPr>
+        <w:pStyle w:val="Heading2"/>
+      </w:pPr>
+      <w:r>
+        <w:rPr>
+          <w:rFonts w:ascii="Arial" w:hAnsi="Arial" w:eastAsia="微软雅黑"/>
+          <w:b/>
+          <w:color w:val="2E5B9A"/>
+          <w:sz w:val="27"/>
+        </w:rPr>
+        <w:t>4.7　快手（1条）</w:t>
+      </w:r>
+    </w:p>
+    <w:tbl>
+      <w:tblPr>
+        <w:tblStyle w:val="TableGrid"/>
+        <w:tblW w:type="auto" w:w="0"/>
+        <w:jc w:val="center"/>
+        <w:tblLook w:firstColumn="1" w:firstRow="1" w:lastColumn="0" w:lastRow="0" w:noHBand="0" w:noVBand="1" w:val="04A0"/>
+      </w:tblPr>
+      <w:tblGrid>
+        <w:gridCol w:w="3249"/>
+        <w:gridCol w:w="3249"/>
+        <w:gridCol w:w="3249"/>
+      </w:tblGrid>
+      <w:tr>
+        <w:tc>
+          <w:tcPr>
+            <w:tcW w:type="dxa" w:w="1247"/>
+            <w:shd w:val="clear" w:fill="1F3864"/>
+          </w:tcPr>
+          <w:p>
+            <w:pPr>
+              <w:jc w:val="center"/>
+            </w:pPr>
+            <w:r>
+              <w:rPr>
+                <w:rFonts w:ascii="Arial" w:hAnsi="Arial" w:eastAsia="微软雅黑"/>
+                <w:b/>
+                <w:color w:val="FFFFFF"/>
+                <w:sz w:val="18"/>
+              </w:rPr>
+              <w:t>日期</w:t>
+            </w:r>
+          </w:p>
+        </w:tc>
+        <w:tc>
+          <w:tcPr>
+            <w:tcW w:type="dxa" w:w="5953"/>
+            <w:shd w:val="clear" w:fill="1F3864"/>
+          </w:tcPr>
+          <w:p>
+            <w:pPr>
+              <w:jc w:val="center"/>
+            </w:pPr>
+            <w:r>
+              <w:rPr>
+                <w:rFonts w:ascii="Arial" w:hAnsi="Arial" w:eastAsia="微软雅黑"/>
+                <w:b/>
+                <w:color w:val="FFFFFF"/>
+                <w:sz w:val="18"/>
+              </w:rPr>
+              <w:t>动态标题</w:t>
+            </w:r>
+          </w:p>
+        </w:tc>
+        <w:tc>
+          <w:tcPr>
+            <w:tcW w:type="dxa" w:w="1417"/>
+            <w:shd w:val="clear" w:fill="1F3864"/>
+          </w:tcPr>
+          <w:p>
+            <w:pPr>
+              <w:jc w:val="center"/>
+            </w:pPr>
+            <w:r>
+              <w:rPr>
+                <w:rFonts w:ascii="Arial" w:hAnsi="Arial" w:eastAsia="微软雅黑"/>
+                <w:b/>
+                <w:color w:val="FFFFFF"/>
+                <w:sz w:val="18"/>
+              </w:rPr>
+              <w:t>子行业</w:t>
+            </w:r>
+          </w:p>
+        </w:tc>
+      </w:tr>
+      <w:tr>
+        <w:tc>
+          <w:tcPr>
+            <w:tcW w:type="dxa" w:w="1247"/>
+          </w:tcPr>
+          <w:p>
+            <w:pPr>
+              <w:jc w:val="left"/>
+            </w:pPr>
+            <w:r>
+              <w:rPr>
+                <w:rFonts w:ascii="Arial" w:hAnsi="Arial" w:eastAsia="宋体"/>
+                <w:b w:val="0"/>
+                <w:sz w:val="18"/>
+              </w:rPr>
+              <w:t>2026-08-04</w:t>
+            </w:r>
+          </w:p>
+        </w:tc>
+        <w:tc>
+          <w:tcPr>
+            <w:tcW w:type="dxa" w:w="5953"/>
+          </w:tcPr>
+          <w:p>
+            <w:pPr>
+              <w:jc w:val="center"/>
+            </w:pPr>
+            <w:r>
+              <w:rPr>
+                <w:rFonts w:ascii="Arial" w:hAnsi="Arial" w:eastAsia="宋体"/>
+                <w:b w:val="0"/>
+                <w:sz w:val="18"/>
+              </w:rPr>
+              <w:t>快手电商818『宠粉节』：8月4日—28日三阶段，头部商家设GMV增量200万–</w:t>
+            </w:r>
+          </w:p>
+        </w:tc>
+        <w:tc>
+          <w:tcPr>
+            <w:tcW w:type="dxa" w:w="1417"/>
+          </w:tcPr>
+          <w:p>
+            <w:pPr>
+              <w:jc w:val="center"/>
+            </w:pPr>
+            <w:r>
+              <w:rPr>
+                <w:rFonts w:ascii="Arial" w:hAnsi="Arial" w:eastAsia="宋体"/>
+                <w:b w:val="0"/>
+                <w:sz w:val="18"/>
+              </w:rPr>
+              <w:t>通用</w:t>
+            </w:r>
+          </w:p>
+        </w:tc>
+      </w:tr>
+    </w:tbl>
+    <w:p>
+      <w:pPr>
+        <w:spacing w:line="360" w:lineRule="auto" w:before="60"/>
+        <w:ind w:firstLine="440"/>
+        <w:shd w:val="clear" w:fill="F2F6FB"/>
+      </w:pPr>
+      <w:r>
+        <w:rPr>
+          <w:rFonts w:ascii="Arial" w:hAnsi="Arial" w:eastAsia="微软雅黑"/>
+          <w:b/>
+          <w:color w:val="2E5B9A"/>
+          <w:sz w:val="21"/>
+        </w:rPr>
+        <w:t>解读：</w:t>
+      </w:r>
+      <w:r>
+        <w:rPr>
+          <w:rFonts w:ascii="Arial" w:hAnsi="Arial" w:eastAsia="宋体"/>
+          <w:color w:val="333333"/>
+          <w:sz w:val="21"/>
+        </w:rPr>
+        <w:t>本平台在窗口期内有公开动态，详见上表来源链接。</w:t>
       </w:r>
     </w:p>
     <w:p>
@@ -8049,7 +9036,7 @@
                 <w:b w:val="0"/>
                 <w:sz w:val="18"/>
               </w:rPr>
-              <w:t>2026-07-23</w:t>
+              <w:t>2026-07-28</w:t>
             </w:r>
           </w:p>
         </w:tc>
@@ -8067,7 +9054,7 @@
                 <w:b w:val="0"/>
                 <w:sz w:val="18"/>
               </w:rPr>
-              <w:t>北京市新增10类『智能家居（含适老化）』以旧换新补贴产品（含智能马桶、智能床）</w:t>
+              <w:t>南平市扩大2026年智能家居购新补贴品类：新增油烟机/燃气灶/洗碗机/干衣机等5类，</w:t>
             </w:r>
           </w:p>
         </w:tc>
@@ -8103,7 +9090,7 @@
                 <w:b w:val="0"/>
                 <w:sz w:val="18"/>
               </w:rPr>
-              <w:t>全屋智能/卫浴厨房/家具</w:t>
+              <w:t>卫浴厨房/全屋智能/家具</w:t>
             </w:r>
           </w:p>
         </w:tc>
@@ -8124,7 +9111,7 @@
                 <w:b w:val="0"/>
                 <w:sz w:val="18"/>
               </w:rPr>
-              <w:t>2026-07-22</w:t>
+              <w:t>2026-08-07</w:t>
             </w:r>
           </w:p>
         </w:tc>
@@ -8143,7 +9130,7 @@
                 <w:b w:val="0"/>
                 <w:sz w:val="18"/>
               </w:rPr>
-              <w:t>福建省2026年智能家居产品购新补贴品类扩围：新增智能吸油烟机/燃气灶/洗碗机/干衣</w:t>
+              <w:t>武汉市公示第六批智能家居购新补贴参与主体名单(线上+线下)</w:t>
             </w:r>
           </w:p>
         </w:tc>
@@ -8181,7 +9168,7 @@
                 <w:b w:val="0"/>
                 <w:sz w:val="18"/>
               </w:rPr>
-              <w:t>全屋智能/卫浴厨房/家具</w:t>
+              <w:t>全屋智能</w:t>
             </w:r>
           </w:p>
         </w:tc>
@@ -8201,7 +9188,7 @@
                 <w:b w:val="0"/>
                 <w:sz w:val="18"/>
               </w:rPr>
-              <w:t>2026-07-16</w:t>
+              <w:t>2026-08-10</w:t>
             </w:r>
           </w:p>
         </w:tc>
@@ -8219,7 +9206,7 @@
                 <w:b w:val="0"/>
                 <w:sz w:val="18"/>
               </w:rPr>
-              <w:t>市场监管总局批准发布508项重要国家标准（含建材26项、家用电器9项）</w:t>
+              <w:t>三明尤溪县公示第十七批家电/数码智能/智能家居购新补贴参与企业(线上)</w:t>
             </w:r>
           </w:p>
         </w:tc>
@@ -8237,7 +9224,7 @@
                 <w:b w:val="0"/>
                 <w:sz w:val="18"/>
               </w:rPr>
-              <w:t>质量标准</w:t>
+              <w:t>国补/以旧换新</w:t>
             </w:r>
           </w:p>
         </w:tc>
@@ -8255,7 +9242,7 @@
                 <w:b w:val="0"/>
                 <w:sz w:val="18"/>
               </w:rPr>
-              <w:t>建材/灯具光源/全屋智能</w:t>
+              <w:t>全屋智能</w:t>
             </w:r>
           </w:p>
         </w:tc>
@@ -8276,7 +9263,7 @@
                 <w:b w:val="0"/>
                 <w:sz w:val="18"/>
               </w:rPr>
-              <w:t>2026-07-16</w:t>
+              <w:t>2026-08-11</w:t>
             </w:r>
           </w:p>
         </w:tc>
@@ -8295,7 +9282,7 @@
                 <w:b w:val="0"/>
                 <w:sz w:val="18"/>
               </w:rPr>
-              <w:t>GB 18584-2024落地执法案例：湖南楚荣家具因床头柜甲醛超标召回53件</w:t>
+              <w:t>中国建筑装饰协会修订并印发《CBDA标准管理办法(2026年修订)》(装协[2026</w:t>
             </w:r>
           </w:p>
         </w:tc>
@@ -8314,7 +9301,7 @@
                 <w:b w:val="0"/>
                 <w:sz w:val="18"/>
               </w:rPr>
-              <w:t>质量标准</w:t>
+              <w:t>标准</w:t>
             </w:r>
           </w:p>
         </w:tc>
@@ -8333,7 +9320,7 @@
                 <w:b w:val="0"/>
                 <w:sz w:val="18"/>
               </w:rPr>
-              <w:t>家具/建材</w:t>
+              <w:t>家装/建筑装饰</w:t>
             </w:r>
           </w:p>
         </w:tc>
@@ -8353,7 +9340,7 @@
                 <w:b w:val="0"/>
                 <w:sz w:val="18"/>
               </w:rPr>
-              <w:t>2025-05-30</w:t>
+              <w:t>2026-07-28</w:t>
             </w:r>
           </w:p>
         </w:tc>
@@ -8371,7 +9358,7 @@
                 <w:b w:val="0"/>
                 <w:sz w:val="18"/>
               </w:rPr>
-              <w:t>GB18580-2025《室内装饰装修材料人造板及其制品中甲醛释放限量》正式实施（E</w:t>
+              <w:t>中国建筑节能协会团体标准《建筑辐射隔热涂料》T/CABEE 145—2026发布</w:t>
             </w:r>
           </w:p>
         </w:tc>
@@ -8389,7 +9376,7 @@
                 <w:b w:val="0"/>
                 <w:sz w:val="18"/>
               </w:rPr>
-              <w:t>环保标准</w:t>
+              <w:t>标准</w:t>
             </w:r>
           </w:p>
         </w:tc>
@@ -8407,7 +9394,7 @@
                 <w:b w:val="0"/>
                 <w:sz w:val="18"/>
               </w:rPr>
-              <w:t>家具/装修/建材/全屋定制</w:t>
+              <w:t>涂料/建材</w:t>
             </w:r>
           </w:p>
         </w:tc>
@@ -8428,7 +9415,7 @@
                 <w:b w:val="0"/>
                 <w:sz w:val="18"/>
               </w:rPr>
-              <w:t>2026-07-10</w:t>
+              <w:t>2026-07-23</w:t>
             </w:r>
           </w:p>
         </w:tc>
@@ -8447,7 +9434,7 @@
                 <w:b w:val="0"/>
                 <w:sz w:val="18"/>
               </w:rPr>
-              <w:t>GB/T 24986.7-2026《家用和类似用途电器可靠性试验及评价 第7部分：电</w:t>
+              <w:t>北京市新增10类『智能家居（含适老化）』以旧换新补贴产品（含智能马桶、智能床）</w:t>
             </w:r>
           </w:p>
         </w:tc>
@@ -8466,7 +9453,7 @@
                 <w:b w:val="0"/>
                 <w:sz w:val="18"/>
               </w:rPr>
-              <w:t>质量标准</w:t>
+              <w:t>国补/以旧换新</w:t>
             </w:r>
           </w:p>
         </w:tc>
@@ -8485,7 +9472,7 @@
                 <w:b w:val="0"/>
                 <w:sz w:val="18"/>
               </w:rPr>
-              <w:t>卫浴厨房</w:t>
+              <w:t>全屋智能/卫浴厨房/家具</w:t>
             </w:r>
           </w:p>
         </w:tc>
@@ -8505,7 +9492,7 @@
                 <w:b w:val="0"/>
                 <w:sz w:val="18"/>
               </w:rPr>
-              <w:t>2026-01-05</w:t>
+              <w:t>2026-07-22</w:t>
             </w:r>
           </w:p>
         </w:tc>
@@ -8523,7 +9510,7 @@
                 <w:b w:val="0"/>
                 <w:sz w:val="18"/>
               </w:rPr>
-              <w:t>T/CREA 056—2026《住宅全案整装服务标准》正式发布并召开宣贯会</w:t>
+              <w:t>福建省2026年智能家居产品购新补贴品类扩围：新增智能吸油烟机/燃气灶/洗碗机/干衣</w:t>
             </w:r>
           </w:p>
         </w:tc>
@@ -8541,7 +9528,7 @@
                 <w:b w:val="0"/>
                 <w:sz w:val="18"/>
               </w:rPr>
-              <w:t>行业规范</w:t>
+              <w:t>国补/以旧换新</w:t>
             </w:r>
           </w:p>
         </w:tc>
@@ -8559,7 +9546,7 @@
                 <w:b w:val="0"/>
                 <w:sz w:val="18"/>
               </w:rPr>
-              <w:t>装修/全屋定制/家具</w:t>
+              <w:t>全屋智能/卫浴厨房/家具</w:t>
             </w:r>
           </w:p>
         </w:tc>
@@ -8580,7 +9567,7 @@
                 <w:b w:val="0"/>
                 <w:sz w:val="18"/>
               </w:rPr>
-              <w:t>2026-06-18</w:t>
+              <w:t>2026-07-16</w:t>
             </w:r>
           </w:p>
         </w:tc>
@@ -8599,7 +9586,7 @@
                 <w:b w:val="0"/>
                 <w:sz w:val="18"/>
               </w:rPr>
-              <w:t>湖南省消费品以旧换新新增10类智能家居家电品类，6月18日起补贴</w:t>
+              <w:t>市场监管总局批准发布508项重要国家标准（含建材26项、家用电器9项）</w:t>
             </w:r>
           </w:p>
         </w:tc>
@@ -8618,7 +9605,7 @@
                 <w:b w:val="0"/>
                 <w:sz w:val="18"/>
               </w:rPr>
-              <w:t>国补/以旧换新</w:t>
+              <w:t>质量标准</w:t>
             </w:r>
           </w:p>
         </w:tc>
@@ -8637,7 +9624,7 @@
                 <w:b w:val="0"/>
                 <w:sz w:val="18"/>
               </w:rPr>
-              <w:t>家具/卫浴厨房/全屋智能</w:t>
+              <w:t>建材/灯具光源/全屋智能</w:t>
             </w:r>
           </w:p>
         </w:tc>
@@ -8657,7 +9644,7 @@
                 <w:b w:val="0"/>
                 <w:sz w:val="18"/>
               </w:rPr>
-              <w:t>2026-05-18</w:t>
+              <w:t>2026-07-16</w:t>
             </w:r>
           </w:p>
         </w:tc>
@@ -8675,7 +9662,7 @@
                 <w:b w:val="0"/>
                 <w:sz w:val="18"/>
               </w:rPr>
-              <w:t>关于开展重点行业节能降碳改造攻坚三年行动的通知（发改环资〔2026〕698号）</w:t>
+              <w:t>GB 18584-2024落地执法案例：湖南楚荣家具因床头柜甲醛超标召回53件</w:t>
             </w:r>
           </w:p>
         </w:tc>
@@ -8693,7 +9680,7 @@
                 <w:b w:val="0"/>
                 <w:sz w:val="18"/>
               </w:rPr>
-              <w:t>环保标准</w:t>
+              <w:t>质量标准</w:t>
             </w:r>
           </w:p>
         </w:tc>
@@ -8711,7 +9698,7 @@
                 <w:b w:val="0"/>
                 <w:sz w:val="18"/>
               </w:rPr>
-              <w:t>建材</w:t>
+              <w:t>家具/建材</w:t>
             </w:r>
           </w:p>
         </w:tc>
@@ -8732,7 +9719,7 @@
                 <w:b w:val="0"/>
                 <w:sz w:val="18"/>
               </w:rPr>
-              <w:t>2026-01-08</w:t>
+              <w:t>2025-05-30</w:t>
             </w:r>
           </w:p>
         </w:tc>
@@ -8751,7 +9738,7 @@
                 <w:b w:val="0"/>
                 <w:sz w:val="18"/>
               </w:rPr>
-              <w:t>商务部等7部门《关于提质增效实施2026年消费品以旧换新工作的通知》延续国补，家居/</w:t>
+              <w:t>GB18580-2025《室内装饰装修材料人造板及其制品中甲醛释放限量》正式实施（E</w:t>
             </w:r>
           </w:p>
         </w:tc>
@@ -8770,7 +9757,7 @@
                 <w:b w:val="0"/>
                 <w:sz w:val="18"/>
               </w:rPr>
-              <w:t>国补/以旧换新</w:t>
+              <w:t>环保标准</w:t>
             </w:r>
           </w:p>
         </w:tc>
@@ -8789,7 +9776,7 @@
                 <w:b w:val="0"/>
                 <w:sz w:val="18"/>
               </w:rPr>
-              <w:t>家具/卫浴厨房/全屋智能/灯具光</w:t>
+              <w:t>家具/装修/建材/全屋定制</w:t>
             </w:r>
           </w:p>
         </w:tc>
@@ -8809,7 +9796,7 @@
                 <w:b w:val="0"/>
                 <w:sz w:val="18"/>
               </w:rPr>
-              <w:t>2026-07-22</w:t>
+              <w:t>2026-07-10</w:t>
             </w:r>
           </w:p>
         </w:tc>
@@ -8827,7 +9814,7 @@
                 <w:b w:val="0"/>
                 <w:sz w:val="18"/>
               </w:rPr>
-              <w:t>福州市扩大2026年智能家居产品购新补贴品类：与省级同步扩围至约10类</w:t>
+              <w:t>GB/T 24986.7-2026《家用和类似用途电器可靠性试验及评价 第7部分：电</w:t>
             </w:r>
           </w:p>
         </w:tc>
@@ -8845,7 +9832,7 @@
                 <w:b w:val="0"/>
                 <w:sz w:val="18"/>
               </w:rPr>
-              <w:t>补贴/以旧换新</w:t>
+              <w:t>质量标准</w:t>
             </w:r>
           </w:p>
         </w:tc>
@@ -8863,7 +9850,7 @@
                 <w:b w:val="0"/>
                 <w:sz w:val="18"/>
               </w:rPr>
-              <w:t>家具/卫浴洁具/五金建材</w:t>
+              <w:t>卫浴厨房</w:t>
             </w:r>
           </w:p>
         </w:tc>
@@ -8884,7 +9871,7 @@
                 <w:b w:val="0"/>
                 <w:sz w:val="18"/>
               </w:rPr>
-              <w:t>2026-07-24</w:t>
+              <w:t>2026-01-05</w:t>
             </w:r>
           </w:p>
         </w:tc>
@@ -8903,7 +9890,7 @@
                 <w:b w:val="0"/>
                 <w:sz w:val="18"/>
               </w:rPr>
-              <w:t>重庆市对2026年智能家居（含适老化家居）购新补贴垫付超50万元单位预拨付资金</w:t>
+              <w:t>T/CREA 056—2026《住宅全案整装服务标准》正式发布并召开宣贯会</w:t>
             </w:r>
           </w:p>
         </w:tc>
@@ -8922,7 +9909,7 @@
                 <w:b w:val="0"/>
                 <w:sz w:val="18"/>
               </w:rPr>
-              <w:t>补贴/以旧换新</w:t>
+              <w:t>行业规范</w:t>
             </w:r>
           </w:p>
         </w:tc>
@@ -8941,7 +9928,7 @@
                 <w:b w:val="0"/>
                 <w:sz w:val="18"/>
               </w:rPr>
-              <w:t>家具/适老化家居/卫浴洁具</w:t>
+              <w:t>装修/全屋定制/家具</w:t>
             </w:r>
           </w:p>
         </w:tc>
@@ -8961,7 +9948,7 @@
                 <w:b w:val="0"/>
                 <w:sz w:val="18"/>
               </w:rPr>
-              <w:t>2026-07-31</w:t>
+              <w:t>2026-06-18</w:t>
             </w:r>
           </w:p>
         </w:tc>
@@ -8979,7 +9966,7 @@
                 <w:b w:val="0"/>
                 <w:sz w:val="18"/>
               </w:rPr>
-              <w:t>8月1日起一批国家标准实施(含甲醛单位产品能耗限额GB 46029-2025)</w:t>
+              <w:t>湖南省消费品以旧换新新增10类智能家居家电品类，6月18日起补贴</w:t>
             </w:r>
           </w:p>
         </w:tc>
@@ -8997,7 +9984,7 @@
                 <w:b w:val="0"/>
                 <w:sz w:val="18"/>
               </w:rPr>
-              <w:t>国标</w:t>
+              <w:t>国补/以旧换新</w:t>
             </w:r>
           </w:p>
         </w:tc>
@@ -9015,7 +10002,7 @@
                 <w:b w:val="0"/>
                 <w:sz w:val="18"/>
               </w:rPr>
-              <w:t>建/材/上/游///绿/色/能/</w:t>
+              <w:t>家具/卫浴厨房/全屋智能</w:t>
             </w:r>
           </w:p>
         </w:tc>
@@ -9036,7 +10023,7 @@
                 <w:b w:val="0"/>
                 <w:sz w:val="18"/>
               </w:rPr>
-              <w:t>2026-08-10</w:t>
+              <w:t>2026-05-18</w:t>
             </w:r>
           </w:p>
         </w:tc>
@@ -9055,7 +10042,7 @@
                 <w:b w:val="0"/>
                 <w:sz w:val="18"/>
               </w:rPr>
-              <w:t>深圳市商务局公布参与2026年线上家电以旧换新、数码和智能产品购新补贴的经营主体名单</w:t>
+              <w:t>关于开展重点行业节能降碳改造攻坚三年行动的通知（发改环资〔2026〕698号）</w:t>
             </w:r>
           </w:p>
         </w:tc>
@@ -9074,7 +10061,7 @@
                 <w:b w:val="0"/>
                 <w:sz w:val="18"/>
               </w:rPr>
-              <w:t>补贴</w:t>
+              <w:t>环保标准</w:t>
             </w:r>
           </w:p>
         </w:tc>
@@ -9093,7 +10080,7 @@
                 <w:b w:val="0"/>
                 <w:sz w:val="18"/>
               </w:rPr>
-              <w:t>全/屋/智/能///家/电/家/</w:t>
+              <w:t>建材</w:t>
             </w:r>
           </w:p>
         </w:tc>
@@ -9113,6 +10100,385 @@
                 <w:b w:val="0"/>
                 <w:sz w:val="18"/>
               </w:rPr>
+              <w:t>2026-01-08</w:t>
+            </w:r>
+          </w:p>
+        </w:tc>
+        <w:tc>
+          <w:tcPr>
+            <w:tcW w:type="dxa" w:w="4252"/>
+          </w:tcPr>
+          <w:p>
+            <w:pPr>
+              <w:jc w:val="center"/>
+            </w:pPr>
+            <w:r>
+              <w:rPr>
+                <w:rFonts w:ascii="Arial" w:hAnsi="Arial" w:eastAsia="宋体"/>
+                <w:b w:val="0"/>
+                <w:sz w:val="18"/>
+              </w:rPr>
+              <w:t>商务部等7部门《关于提质增效实施2026年消费品以旧换新工作的通知》延续国补，家居/</w:t>
+            </w:r>
+          </w:p>
+        </w:tc>
+        <w:tc>
+          <w:tcPr>
+            <w:tcW w:type="dxa" w:w="1304"/>
+          </w:tcPr>
+          <w:p>
+            <w:pPr>
+              <w:jc w:val="center"/>
+            </w:pPr>
+            <w:r>
+              <w:rPr>
+                <w:rFonts w:ascii="Arial" w:hAnsi="Arial" w:eastAsia="宋体"/>
+                <w:b w:val="0"/>
+                <w:sz w:val="18"/>
+              </w:rPr>
+              <w:t>国补/以旧换新</w:t>
+            </w:r>
+          </w:p>
+        </w:tc>
+        <w:tc>
+          <w:tcPr>
+            <w:tcW w:type="dxa" w:w="1814"/>
+          </w:tcPr>
+          <w:p>
+            <w:pPr>
+              <w:jc w:val="center"/>
+            </w:pPr>
+            <w:r>
+              <w:rPr>
+                <w:rFonts w:ascii="Arial" w:hAnsi="Arial" w:eastAsia="宋体"/>
+                <w:b w:val="0"/>
+                <w:sz w:val="18"/>
+              </w:rPr>
+              <w:t>家具/卫浴厨房/全屋智能/灯具光</w:t>
+            </w:r>
+          </w:p>
+        </w:tc>
+      </w:tr>
+      <w:tr>
+        <w:tc>
+          <w:tcPr>
+            <w:tcW w:type="dxa" w:w="1247"/>
+            <w:shd w:val="clear" w:fill="F4F6F9"/>
+          </w:tcPr>
+          <w:p>
+            <w:pPr>
+              <w:jc w:val="left"/>
+            </w:pPr>
+            <w:r>
+              <w:rPr>
+                <w:rFonts w:ascii="Arial" w:hAnsi="Arial" w:eastAsia="宋体"/>
+                <w:b w:val="0"/>
+                <w:sz w:val="18"/>
+              </w:rPr>
+              <w:t>2026-07-22</w:t>
+            </w:r>
+          </w:p>
+        </w:tc>
+        <w:tc>
+          <w:tcPr>
+            <w:tcW w:type="dxa" w:w="4252"/>
+            <w:shd w:val="clear" w:fill="F4F6F9"/>
+          </w:tcPr>
+          <w:p>
+            <w:pPr>
+              <w:jc w:val="center"/>
+            </w:pPr>
+            <w:r>
+              <w:rPr>
+                <w:rFonts w:ascii="Arial" w:hAnsi="Arial" w:eastAsia="宋体"/>
+                <w:b w:val="0"/>
+                <w:sz w:val="18"/>
+              </w:rPr>
+              <w:t>福州市扩大2026年智能家居产品购新补贴品类：与省级同步扩围至约10类</w:t>
+            </w:r>
+          </w:p>
+        </w:tc>
+        <w:tc>
+          <w:tcPr>
+            <w:tcW w:type="dxa" w:w="1304"/>
+            <w:shd w:val="clear" w:fill="F4F6F9"/>
+          </w:tcPr>
+          <w:p>
+            <w:pPr>
+              <w:jc w:val="center"/>
+            </w:pPr>
+            <w:r>
+              <w:rPr>
+                <w:rFonts w:ascii="Arial" w:hAnsi="Arial" w:eastAsia="宋体"/>
+                <w:b w:val="0"/>
+                <w:sz w:val="18"/>
+              </w:rPr>
+              <w:t>补贴/以旧换新</w:t>
+            </w:r>
+          </w:p>
+        </w:tc>
+        <w:tc>
+          <w:tcPr>
+            <w:tcW w:type="dxa" w:w="1814"/>
+            <w:shd w:val="clear" w:fill="F4F6F9"/>
+          </w:tcPr>
+          <w:p>
+            <w:pPr>
+              <w:jc w:val="center"/>
+            </w:pPr>
+            <w:r>
+              <w:rPr>
+                <w:rFonts w:ascii="Arial" w:hAnsi="Arial" w:eastAsia="宋体"/>
+                <w:b w:val="0"/>
+                <w:sz w:val="18"/>
+              </w:rPr>
+              <w:t>家具/卫浴洁具/五金建材</w:t>
+            </w:r>
+          </w:p>
+        </w:tc>
+      </w:tr>
+      <w:tr>
+        <w:tc>
+          <w:tcPr>
+            <w:tcW w:type="dxa" w:w="1247"/>
+          </w:tcPr>
+          <w:p>
+            <w:pPr>
+              <w:jc w:val="left"/>
+            </w:pPr>
+            <w:r>
+              <w:rPr>
+                <w:rFonts w:ascii="Arial" w:hAnsi="Arial" w:eastAsia="宋体"/>
+                <w:b w:val="0"/>
+                <w:sz w:val="18"/>
+              </w:rPr>
+              <w:t>2026-07-24</w:t>
+            </w:r>
+          </w:p>
+        </w:tc>
+        <w:tc>
+          <w:tcPr>
+            <w:tcW w:type="dxa" w:w="4252"/>
+          </w:tcPr>
+          <w:p>
+            <w:pPr>
+              <w:jc w:val="center"/>
+            </w:pPr>
+            <w:r>
+              <w:rPr>
+                <w:rFonts w:ascii="Arial" w:hAnsi="Arial" w:eastAsia="宋体"/>
+                <w:b w:val="0"/>
+                <w:sz w:val="18"/>
+              </w:rPr>
+              <w:t>重庆市对2026年智能家居（含适老化家居）购新补贴垫付超50万元单位预拨付资金</w:t>
+            </w:r>
+          </w:p>
+        </w:tc>
+        <w:tc>
+          <w:tcPr>
+            <w:tcW w:type="dxa" w:w="1304"/>
+          </w:tcPr>
+          <w:p>
+            <w:pPr>
+              <w:jc w:val="center"/>
+            </w:pPr>
+            <w:r>
+              <w:rPr>
+                <w:rFonts w:ascii="Arial" w:hAnsi="Arial" w:eastAsia="宋体"/>
+                <w:b w:val="0"/>
+                <w:sz w:val="18"/>
+              </w:rPr>
+              <w:t>补贴/以旧换新</w:t>
+            </w:r>
+          </w:p>
+        </w:tc>
+        <w:tc>
+          <w:tcPr>
+            <w:tcW w:type="dxa" w:w="1814"/>
+          </w:tcPr>
+          <w:p>
+            <w:pPr>
+              <w:jc w:val="center"/>
+            </w:pPr>
+            <w:r>
+              <w:rPr>
+                <w:rFonts w:ascii="Arial" w:hAnsi="Arial" w:eastAsia="宋体"/>
+                <w:b w:val="0"/>
+                <w:sz w:val="18"/>
+              </w:rPr>
+              <w:t>家具/适老化家居/卫浴洁具</w:t>
+            </w:r>
+          </w:p>
+        </w:tc>
+      </w:tr>
+      <w:tr>
+        <w:tc>
+          <w:tcPr>
+            <w:tcW w:type="dxa" w:w="1247"/>
+            <w:shd w:val="clear" w:fill="F4F6F9"/>
+          </w:tcPr>
+          <w:p>
+            <w:pPr>
+              <w:jc w:val="left"/>
+            </w:pPr>
+            <w:r>
+              <w:rPr>
+                <w:rFonts w:ascii="Arial" w:hAnsi="Arial" w:eastAsia="宋体"/>
+                <w:b w:val="0"/>
+                <w:sz w:val="18"/>
+              </w:rPr>
+              <w:t>2026-07-31</w:t>
+            </w:r>
+          </w:p>
+        </w:tc>
+        <w:tc>
+          <w:tcPr>
+            <w:tcW w:type="dxa" w:w="4252"/>
+            <w:shd w:val="clear" w:fill="F4F6F9"/>
+          </w:tcPr>
+          <w:p>
+            <w:pPr>
+              <w:jc w:val="center"/>
+            </w:pPr>
+            <w:r>
+              <w:rPr>
+                <w:rFonts w:ascii="Arial" w:hAnsi="Arial" w:eastAsia="宋体"/>
+                <w:b w:val="0"/>
+                <w:sz w:val="18"/>
+              </w:rPr>
+              <w:t>8月1日起一批国家标准实施(含甲醛单位产品能耗限额GB 46029-2025)</w:t>
+            </w:r>
+          </w:p>
+        </w:tc>
+        <w:tc>
+          <w:tcPr>
+            <w:tcW w:type="dxa" w:w="1304"/>
+            <w:shd w:val="clear" w:fill="F4F6F9"/>
+          </w:tcPr>
+          <w:p>
+            <w:pPr>
+              <w:jc w:val="center"/>
+            </w:pPr>
+            <w:r>
+              <w:rPr>
+                <w:rFonts w:ascii="Arial" w:hAnsi="Arial" w:eastAsia="宋体"/>
+                <w:b w:val="0"/>
+                <w:sz w:val="18"/>
+              </w:rPr>
+              <w:t>国标</w:t>
+            </w:r>
+          </w:p>
+        </w:tc>
+        <w:tc>
+          <w:tcPr>
+            <w:tcW w:type="dxa" w:w="1814"/>
+            <w:shd w:val="clear" w:fill="F4F6F9"/>
+          </w:tcPr>
+          <w:p>
+            <w:pPr>
+              <w:jc w:val="center"/>
+            </w:pPr>
+            <w:r>
+              <w:rPr>
+                <w:rFonts w:ascii="Arial" w:hAnsi="Arial" w:eastAsia="宋体"/>
+                <w:b w:val="0"/>
+                <w:sz w:val="18"/>
+              </w:rPr>
+              <w:t>建/材/上/游///绿/色/能/</w:t>
+            </w:r>
+          </w:p>
+        </w:tc>
+      </w:tr>
+      <w:tr>
+        <w:tc>
+          <w:tcPr>
+            <w:tcW w:type="dxa" w:w="1247"/>
+          </w:tcPr>
+          <w:p>
+            <w:pPr>
+              <w:jc w:val="left"/>
+            </w:pPr>
+            <w:r>
+              <w:rPr>
+                <w:rFonts w:ascii="Arial" w:hAnsi="Arial" w:eastAsia="宋体"/>
+                <w:b w:val="0"/>
+                <w:sz w:val="18"/>
+              </w:rPr>
+              <w:t>2026-08-10</w:t>
+            </w:r>
+          </w:p>
+        </w:tc>
+        <w:tc>
+          <w:tcPr>
+            <w:tcW w:type="dxa" w:w="4252"/>
+          </w:tcPr>
+          <w:p>
+            <w:pPr>
+              <w:jc w:val="center"/>
+            </w:pPr>
+            <w:r>
+              <w:rPr>
+                <w:rFonts w:ascii="Arial" w:hAnsi="Arial" w:eastAsia="宋体"/>
+                <w:b w:val="0"/>
+                <w:sz w:val="18"/>
+              </w:rPr>
+              <w:t>深圳市商务局公布参与2026年线上家电以旧换新、数码和智能产品购新补贴的经营主体名单</w:t>
+            </w:r>
+          </w:p>
+        </w:tc>
+        <w:tc>
+          <w:tcPr>
+            <w:tcW w:type="dxa" w:w="1304"/>
+          </w:tcPr>
+          <w:p>
+            <w:pPr>
+              <w:jc w:val="center"/>
+            </w:pPr>
+            <w:r>
+              <w:rPr>
+                <w:rFonts w:ascii="Arial" w:hAnsi="Arial" w:eastAsia="宋体"/>
+                <w:b w:val="0"/>
+                <w:sz w:val="18"/>
+              </w:rPr>
+              <w:t>补贴</w:t>
+            </w:r>
+          </w:p>
+        </w:tc>
+        <w:tc>
+          <w:tcPr>
+            <w:tcW w:type="dxa" w:w="1814"/>
+          </w:tcPr>
+          <w:p>
+            <w:pPr>
+              <w:jc w:val="center"/>
+            </w:pPr>
+            <w:r>
+              <w:rPr>
+                <w:rFonts w:ascii="Arial" w:hAnsi="Arial" w:eastAsia="宋体"/>
+                <w:b w:val="0"/>
+                <w:sz w:val="18"/>
+              </w:rPr>
+              <w:t>全/屋/智/能///家/电/家/</w:t>
+            </w:r>
+          </w:p>
+        </w:tc>
+      </w:tr>
+      <w:tr>
+        <w:tc>
+          <w:tcPr>
+            <w:tcW w:type="dxa" w:w="1247"/>
+            <w:shd w:val="clear" w:fill="F4F6F9"/>
+          </w:tcPr>
+          <w:p>
+            <w:pPr>
+              <w:jc w:val="left"/>
+            </w:pPr>
+            <w:r>
+              <w:rPr>
+                <w:rFonts w:ascii="Arial" w:hAnsi="Arial" w:eastAsia="宋体"/>
+                <w:b w:val="0"/>
+                <w:sz w:val="18"/>
+              </w:rPr>
               <w:t>2026-08-11</w:t>
             </w:r>
           </w:p>
@@ -9120,6 +10486,7 @@
         <w:tc>
           <w:tcPr>
             <w:tcW w:type="dxa" w:w="4252"/>
+            <w:shd w:val="clear" w:fill="F4F6F9"/>
           </w:tcPr>
           <w:p>
             <w:pPr>
@@ -9138,6 +10505,7 @@
         <w:tc>
           <w:tcPr>
             <w:tcW w:type="dxa" w:w="1304"/>
+            <w:shd w:val="clear" w:fill="F4F6F9"/>
           </w:tcPr>
           <w:p>
             <w:pPr>
@@ -9156,6 +10524,7 @@
         <w:tc>
           <w:tcPr>
             <w:tcW w:type="dxa" w:w="1814"/>
+            <w:shd w:val="clear" w:fill="F4F6F9"/>
           </w:tcPr>
           <w:p>
             <w:pPr>
@@ -9997,7 +11366,7 @@
                 <w:b w:val="0"/>
                 <w:sz w:val="18"/>
               </w:rPr>
-              <w:t>2026-07-14</w:t>
+              <w:t>2026-08-13</w:t>
             </w:r>
           </w:p>
         </w:tc>
@@ -10015,7 +11384,7 @@
                 <w:b w:val="0"/>
                 <w:sz w:val="18"/>
               </w:rPr>
-              <w:t>慕思股份(001323)</w:t>
+              <w:t>曲美家居(603818)</w:t>
             </w:r>
           </w:p>
         </w:tc>
@@ -10033,7 +11402,7 @@
                 <w:b w:val="0"/>
                 <w:sz w:val="18"/>
               </w:rPr>
-              <w:t>半年报预告(预减)</w:t>
+              <w:t>公告(关联交易)</w:t>
             </w:r>
           </w:p>
         </w:tc>
@@ -10051,7 +11420,7 @@
                 <w:b w:val="0"/>
                 <w:sz w:val="18"/>
               </w:rPr>
-              <w:t>预计2026H1归母净利润1.75亿-2.00亿元，同比下降…</w:t>
+              <w:t>披露《关联交易公告》(编号2026-036)：实控人赵瑞海之…</w:t>
             </w:r>
           </w:p>
         </w:tc>
@@ -10072,7 +11441,7 @@
                 <w:b w:val="0"/>
                 <w:sz w:val="18"/>
               </w:rPr>
-              <w:t>2026-07-15</w:t>
+              <w:t>2026-08-13</w:t>
             </w:r>
           </w:p>
         </w:tc>
@@ -10091,7 +11460,7 @@
                 <w:b w:val="0"/>
                 <w:sz w:val="18"/>
               </w:rPr>
-              <w:t>蒙娜丽莎(002918)</w:t>
+              <w:t>江河集团(601886)</w:t>
             </w:r>
           </w:p>
         </w:tc>
@@ -10110,7 +11479,7 @@
                 <w:b w:val="0"/>
                 <w:sz w:val="18"/>
               </w:rPr>
-              <w:t>半年报预告(扭亏)</w:t>
+              <w:t>公告(股票异常波动)</w:t>
             </w:r>
           </w:p>
         </w:tc>
@@ -10129,7 +11498,7 @@
                 <w:b w:val="0"/>
                 <w:sz w:val="18"/>
               </w:rPr>
-              <w:t>预计2026H1归母净利润4088万-6131万元，同比扭亏…</w:t>
+              <w:t>披露《股票交易异常波动公告》(临2026-037)：08-1…</w:t>
             </w:r>
           </w:p>
         </w:tc>
@@ -10149,7 +11518,7 @@
                 <w:b w:val="0"/>
                 <w:sz w:val="18"/>
               </w:rPr>
-              <w:t>2026-07-15</w:t>
+              <w:t>2026-08-13</w:t>
             </w:r>
           </w:p>
         </w:tc>
@@ -10167,7 +11536,7 @@
                 <w:b w:val="0"/>
                 <w:sz w:val="18"/>
               </w:rPr>
-              <w:t>金牌家居(603180)</w:t>
+              <w:t>北新建材(000786)</w:t>
             </w:r>
           </w:p>
         </w:tc>
@@ -10185,7 +11554,7 @@
                 <w:b w:val="0"/>
                 <w:sz w:val="18"/>
               </w:rPr>
-              <w:t>半年报预告(预亏)</w:t>
+              <w:t>公告(业绩说明会)</w:t>
             </w:r>
           </w:p>
         </w:tc>
@@ -10203,7 +11572,7 @@
                 <w:b w:val="0"/>
                 <w:sz w:val="18"/>
               </w:rPr>
-              <w:t>预计2026H1归母净利润亏损1.10亿-1.40亿元，由盈…</w:t>
+              <w:t>披露公告(2026-029)：拟于2026-08-21在深交…</w:t>
             </w:r>
           </w:p>
         </w:tc>
@@ -10224,7 +11593,7 @@
                 <w:b w:val="0"/>
                 <w:sz w:val="18"/>
               </w:rPr>
-              <w:t>2026-07-15</w:t>
+              <w:t>2026-07-14</w:t>
             </w:r>
           </w:p>
         </w:tc>
@@ -10243,7 +11612,7 @@
                 <w:b w:val="0"/>
                 <w:sz w:val="18"/>
               </w:rPr>
-              <w:t>惠达卫浴(603385)</w:t>
+              <w:t>慕思股份(001323)</w:t>
             </w:r>
           </w:p>
         </w:tc>
@@ -10262,7 +11631,7 @@
                 <w:b w:val="0"/>
                 <w:sz w:val="18"/>
               </w:rPr>
-              <w:t>半年报预告(预亏)</w:t>
+              <w:t>半年报预告(预减)</w:t>
             </w:r>
           </w:p>
         </w:tc>
@@ -10281,7 +11650,7 @@
                 <w:b w:val="0"/>
                 <w:sz w:val="18"/>
               </w:rPr>
-              <w:t>预计2026H1归母净利润亏损7200万-9000万元。卫浴…</w:t>
+              <w:t>预计2026H1归母净利润1.75亿-2.00亿元，同比下降…</w:t>
             </w:r>
           </w:p>
         </w:tc>
@@ -10319,7 +11688,7 @@
                 <w:b w:val="0"/>
                 <w:sz w:val="18"/>
               </w:rPr>
-              <w:t>梦百合(603313)</w:t>
+              <w:t>蒙娜丽莎(002918)</w:t>
             </w:r>
           </w:p>
         </w:tc>
@@ -10337,7 +11706,7 @@
                 <w:b w:val="0"/>
                 <w:sz w:val="18"/>
               </w:rPr>
-              <w:t>半年报预告(预减)</w:t>
+              <w:t>半年报预告(扭亏)</w:t>
             </w:r>
           </w:p>
         </w:tc>
@@ -10355,7 +11724,7 @@
                 <w:b w:val="0"/>
                 <w:sz w:val="18"/>
               </w:rPr>
-              <w:t>预计2026H1归母净利润0元-800万元，同比下降93.0…</w:t>
+              <w:t>预计2026H1归母净利润4088万-6131万元，同比扭亏…</w:t>
             </w:r>
           </w:p>
         </w:tc>
@@ -10376,7 +11745,7 @@
                 <w:b w:val="0"/>
                 <w:sz w:val="18"/>
               </w:rPr>
-              <w:t>2026-07-14</w:t>
+              <w:t>2026-07-15</w:t>
             </w:r>
           </w:p>
         </w:tc>
@@ -10395,7 +11764,7 @@
                 <w:b w:val="0"/>
                 <w:sz w:val="18"/>
               </w:rPr>
-              <w:t>好莱客(603898)</w:t>
+              <w:t>金牌家居(603180)</w:t>
             </w:r>
           </w:p>
         </w:tc>
@@ -10433,7 +11802,7 @@
                 <w:b w:val="0"/>
                 <w:sz w:val="18"/>
               </w:rPr>
-              <w:t>预计2026H1归母净利润亏损约2700万-3700万元，由…</w:t>
+              <w:t>预计2026H1归母净利润亏损1.10亿-1.40亿元，由盈…</w:t>
             </w:r>
           </w:p>
         </w:tc>
@@ -10453,7 +11822,7 @@
                 <w:b w:val="0"/>
                 <w:sz w:val="18"/>
               </w:rPr>
-              <w:t>2026-07-24</w:t>
+              <w:t>2026-07-15</w:t>
             </w:r>
           </w:p>
         </w:tc>
@@ -10471,7 +11840,7 @@
                 <w:b w:val="0"/>
                 <w:sz w:val="18"/>
               </w:rPr>
-              <w:t>三棵树(603737)</w:t>
+              <w:t>惠达卫浴(603385)</w:t>
             </w:r>
           </w:p>
         </w:tc>
@@ -10489,7 +11858,7 @@
                 <w:b w:val="0"/>
                 <w:sz w:val="18"/>
               </w:rPr>
-              <w:t>年报问询函回复</w:t>
+              <w:t>半年报预告(预亏)</w:t>
             </w:r>
           </w:p>
         </w:tc>
@@ -10507,7 +11876,7 @@
                 <w:b w:val="0"/>
                 <w:sz w:val="18"/>
               </w:rPr>
-              <w:t>回复上交所对2025年报的问询函：2025年归母净利7.75…</w:t>
+              <w:t>预计2026H1归母净利润亏损7200万-9000万元。卫浴…</w:t>
             </w:r>
           </w:p>
         </w:tc>
@@ -10528,7 +11897,7 @@
                 <w:b w:val="0"/>
                 <w:sz w:val="18"/>
               </w:rPr>
-              <w:t>2026-07-20</w:t>
+              <w:t>2026-07-15</w:t>
             </w:r>
           </w:p>
         </w:tc>
@@ -10547,7 +11916,7 @@
                 <w:b w:val="0"/>
                 <w:sz w:val="18"/>
               </w:rPr>
-              <w:t>公牛集团(603195)</w:t>
+              <w:t>梦百合(603313)</w:t>
             </w:r>
           </w:p>
         </w:tc>
@@ -10566,7 +11935,7 @@
                 <w:b w:val="0"/>
                 <w:sz w:val="18"/>
               </w:rPr>
-              <w:t>公告(员工持股计划)</w:t>
+              <w:t>半年报预告(预减)</w:t>
             </w:r>
           </w:p>
         </w:tc>
@@ -10585,7 +11954,7 @@
                 <w:b w:val="0"/>
                 <w:sz w:val="18"/>
               </w:rPr>
-              <w:t>2026年员工持股计划第一次持有人会议(7月17日通讯方式召…</w:t>
+              <w:t>预计2026H1归母净利润0元-800万元，同比下降93.0…</w:t>
             </w:r>
           </w:p>
         </w:tc>
@@ -10605,7 +11974,7 @@
                 <w:b w:val="0"/>
                 <w:sz w:val="18"/>
               </w:rPr>
-              <w:t>2026-07-20</w:t>
+              <w:t>2026-07-14</w:t>
             </w:r>
           </w:p>
         </w:tc>
@@ -10623,7 +11992,7 @@
                 <w:b w:val="0"/>
                 <w:sz w:val="18"/>
               </w:rPr>
-              <w:t>东鹏控股(003012)</w:t>
+              <w:t>好莱客(603898)</w:t>
             </w:r>
           </w:p>
         </w:tc>
@@ -10641,7 +12010,7 @@
                 <w:b w:val="0"/>
                 <w:sz w:val="18"/>
               </w:rPr>
-              <w:t>公告(回购进展)</w:t>
+              <w:t>半年报预告(预亏)</w:t>
             </w:r>
           </w:p>
         </w:tc>
@@ -10659,7 +12028,7 @@
                 <w:b w:val="0"/>
                 <w:sz w:val="18"/>
               </w:rPr>
-              <w:t>截至公告日累计回购5,535,000股(占总股本0.48%)…</w:t>
+              <w:t>预计2026H1归母净利润亏损约2700万-3700万元，由…</w:t>
             </w:r>
           </w:p>
         </w:tc>
@@ -10680,7 +12049,7 @@
                 <w:b w:val="0"/>
                 <w:sz w:val="18"/>
               </w:rPr>
-              <w:t>2026-07-22</w:t>
+              <w:t>2026-07-24</w:t>
             </w:r>
           </w:p>
         </w:tc>
@@ -10699,7 +12068,7 @@
                 <w:b w:val="0"/>
                 <w:sz w:val="18"/>
               </w:rPr>
-              <w:t>志邦家居(603801)</w:t>
+              <w:t>三棵树(603737)</w:t>
             </w:r>
           </w:p>
         </w:tc>
@@ -10718,7 +12087,7 @@
                 <w:b w:val="0"/>
                 <w:sz w:val="18"/>
               </w:rPr>
-              <w:t>公告(解除质押)</w:t>
+              <w:t>年报问询函回复</w:t>
             </w:r>
           </w:p>
         </w:tc>
@@ -10737,7 +12106,7 @@
                 <w:b w:val="0"/>
                 <w:sz w:val="18"/>
               </w:rPr>
-              <w:t>大股东许帮顺解除质押5,160,000股(占总股本1.19%…</w:t>
+              <w:t>回复上交所对2025年报的问询函：2025年归母净利7.75…</w:t>
             </w:r>
           </w:p>
         </w:tc>
@@ -10757,7 +12126,7 @@
                 <w:b w:val="0"/>
                 <w:sz w:val="18"/>
               </w:rPr>
-              <w:t>2026-07-22</w:t>
+              <w:t>2026-07-20</w:t>
             </w:r>
           </w:p>
         </w:tc>
@@ -10775,7 +12144,7 @@
                 <w:b w:val="0"/>
                 <w:sz w:val="18"/>
               </w:rPr>
-              <w:t>顾家家居(603816)</w:t>
+              <w:t>公牛集团(603195)</w:t>
             </w:r>
           </w:p>
         </w:tc>
@@ -10793,7 +12162,7 @@
                 <w:b w:val="0"/>
                 <w:sz w:val="18"/>
               </w:rPr>
-              <w:t>公告(临时股东会决议)</w:t>
+              <w:t>公告(员工持股计划)</w:t>
             </w:r>
           </w:p>
         </w:tc>
@@ -10811,7 +12180,7 @@
                 <w:b w:val="0"/>
                 <w:sz w:val="18"/>
               </w:rPr>
-              <w:t>2026年第一次临时股东会召开(此前定于07-22)，审议通…</w:t>
+              <w:t>2026年员工持股计划第一次持有人会议(7月17日通讯方式召…</w:t>
             </w:r>
           </w:p>
         </w:tc>
@@ -10832,7 +12201,7 @@
                 <w:b w:val="0"/>
                 <w:sz w:val="18"/>
               </w:rPr>
-              <w:t>2026-07-14</w:t>
+              <w:t>2026-07-20</w:t>
             </w:r>
           </w:p>
         </w:tc>
@@ -10851,7 +12220,7 @@
                 <w:b w:val="0"/>
                 <w:sz w:val="18"/>
               </w:rPr>
-              <w:t>欧派家居(603833)</w:t>
+              <w:t>东鹏控股(003012)</w:t>
             </w:r>
           </w:p>
         </w:tc>
@@ -10870,7 +12239,7 @@
                 <w:b w:val="0"/>
                 <w:sz w:val="18"/>
               </w:rPr>
-              <w:t>半年报预告</w:t>
+              <w:t>公告(回购进展)</w:t>
             </w:r>
           </w:p>
         </w:tc>
@@ -10889,7 +12258,7 @@
                 <w:b w:val="0"/>
                 <w:sz w:val="18"/>
               </w:rPr>
-              <w:t>预计2026H1归母净利润4.07亿-5.09亿元，同比减少…</w:t>
+              <w:t>截至公告日累计回购5,535,000股(占总股本0.48%)…</w:t>
             </w:r>
           </w:p>
         </w:tc>
@@ -10909,7 +12278,7 @@
                 <w:b w:val="0"/>
                 <w:sz w:val="18"/>
               </w:rPr>
-              <w:t>2026-07-14</w:t>
+              <w:t>2026-07-22</w:t>
             </w:r>
           </w:p>
         </w:tc>
@@ -10927,7 +12296,7 @@
                 <w:b w:val="0"/>
                 <w:sz w:val="18"/>
               </w:rPr>
-              <w:t>索菲亚(002572)</w:t>
+              <w:t>志邦家居(603801)</w:t>
             </w:r>
           </w:p>
         </w:tc>
@@ -10945,7 +12314,7 @@
                 <w:b w:val="0"/>
                 <w:sz w:val="18"/>
               </w:rPr>
-              <w:t>半年报预告</w:t>
+              <w:t>公告(解除质押)</w:t>
             </w:r>
           </w:p>
         </w:tc>
@@ -10963,7 +12332,7 @@
                 <w:b w:val="0"/>
                 <w:sz w:val="18"/>
               </w:rPr>
-              <w:t>预计2026H1归母净利润4790.70万-7026.36万…</w:t>
+              <w:t>大股东许帮顺解除质押5,160,000股(占总股本1.19%…</w:t>
             </w:r>
           </w:p>
         </w:tc>
@@ -10984,7 +12353,7 @@
                 <w:b w:val="0"/>
                 <w:sz w:val="18"/>
               </w:rPr>
-              <w:t>2026-07-13</w:t>
+              <w:t>2026-07-22</w:t>
             </w:r>
           </w:p>
         </w:tc>
@@ -11003,7 +12372,7 @@
                 <w:b w:val="0"/>
                 <w:sz w:val="18"/>
               </w:rPr>
-              <w:t>志邦家居(603801)</w:t>
+              <w:t>顾家家居(603816)</w:t>
             </w:r>
           </w:p>
         </w:tc>
@@ -11022,7 +12391,7 @@
                 <w:b w:val="0"/>
                 <w:sz w:val="18"/>
               </w:rPr>
-              <w:t>半年报预告(预亏)</w:t>
+              <w:t>公告(临时股东会决议)</w:t>
             </w:r>
           </w:p>
         </w:tc>
@@ -11041,7 +12410,7 @@
                 <w:b w:val="0"/>
                 <w:sz w:val="18"/>
               </w:rPr>
-              <w:t>预计2026H1归母净利润-1.89亿至-1.26亿元，去年…</w:t>
+              <w:t>2026年第一次临时股东会召开(此前定于07-22)，审议通…</w:t>
             </w:r>
           </w:p>
         </w:tc>
@@ -11061,7 +12430,7 @@
                 <w:b w:val="0"/>
                 <w:sz w:val="18"/>
               </w:rPr>
-              <w:t>2026-07-15</w:t>
+              <w:t>2026-07-14</w:t>
             </w:r>
           </w:p>
         </w:tc>
@@ -11079,7 +12448,7 @@
                 <w:b w:val="0"/>
                 <w:sz w:val="18"/>
               </w:rPr>
-              <w:t>红星美凯龙(601828)</w:t>
+              <w:t>欧派家居(603833)</w:t>
             </w:r>
           </w:p>
         </w:tc>
@@ -11097,7 +12466,7 @@
                 <w:b w:val="0"/>
                 <w:sz w:val="18"/>
               </w:rPr>
-              <w:t>半年报预告(扭亏)</w:t>
+              <w:t>半年报预告</w:t>
             </w:r>
           </w:p>
         </w:tc>
@@ -11115,7 +12484,7 @@
                 <w:b w:val="0"/>
                 <w:sz w:val="18"/>
               </w:rPr>
-              <w:t>预计2026H1归母净利润5000万-7500万元（上年同期…</w:t>
+              <w:t>预计2026H1归母净利润4.07亿-5.09亿元，同比减少…</w:t>
             </w:r>
           </w:p>
         </w:tc>
@@ -11136,7 +12505,7 @@
                 <w:b w:val="0"/>
                 <w:sz w:val="18"/>
               </w:rPr>
-              <w:t>2026-07-10</w:t>
+              <w:t>2026-07-14</w:t>
             </w:r>
           </w:p>
         </w:tc>
@@ -11155,7 +12524,7 @@
                 <w:b w:val="0"/>
                 <w:sz w:val="18"/>
               </w:rPr>
-              <w:t>九牧集团</w:t>
+              <w:t>索菲亚(002572)</w:t>
             </w:r>
           </w:p>
         </w:tc>
@@ -11174,7 +12543,7 @@
                 <w:b w:val="0"/>
                 <w:sz w:val="18"/>
               </w:rPr>
-              <w:t>标准发布/技术引领</w:t>
+              <w:t>半年报预告</w:t>
             </w:r>
           </w:p>
         </w:tc>
@@ -11193,7 +12562,7 @@
                 <w:b w:val="0"/>
                 <w:sz w:val="18"/>
               </w:rPr>
-              <w:t>作为第一牵头单位主导制定的GB/T 24986.7-2026…</w:t>
+              <w:t>预计2026H1归母净利润4790.70万-7026.36万…</w:t>
             </w:r>
           </w:p>
         </w:tc>
@@ -11213,7 +12582,7 @@
                 <w:b w:val="0"/>
                 <w:sz w:val="18"/>
               </w:rPr>
-              <w:t>2026-07-09</w:t>
+              <w:t>2026-07-13</w:t>
             </w:r>
           </w:p>
         </w:tc>
@@ -11231,7 +12600,7 @@
                 <w:b w:val="0"/>
                 <w:sz w:val="18"/>
               </w:rPr>
-              <w:t>恒洁卫浴</w:t>
+              <w:t>志邦家居(603801)</w:t>
             </w:r>
           </w:p>
         </w:tc>
@@ -11249,7 +12618,7 @@
                 <w:b w:val="0"/>
                 <w:sz w:val="18"/>
               </w:rPr>
-              <w:t>发布会/渠道活动</w:t>
+              <w:t>半年报预告(预亏)</w:t>
             </w:r>
           </w:p>
         </w:tc>
@@ -11267,7 +12636,7 @@
                 <w:b w:val="0"/>
                 <w:sz w:val="18"/>
               </w:rPr>
-              <w:t>'焕新中国行·乐动此间'恒洁28周年庆启幕（佛山）。全国30…</w:t>
+              <w:t>预计2026H1归母净利润-1.89亿至-1.26亿元，去年…</w:t>
             </w:r>
           </w:p>
         </w:tc>
@@ -11288,7 +12657,7 @@
                 <w:b w:val="0"/>
                 <w:sz w:val="18"/>
               </w:rPr>
-              <w:t>2026-07-09</w:t>
+              <w:t>2026-07-15</w:t>
             </w:r>
           </w:p>
         </w:tc>
@@ -11307,7 +12676,7 @@
                 <w:b w:val="0"/>
                 <w:sz w:val="18"/>
               </w:rPr>
-              <w:t>舒达智能</w:t>
+              <w:t>红星美凯龙(601828)</w:t>
             </w:r>
           </w:p>
         </w:tc>
@@ -11326,7 +12695,7 @@
                 <w:b w:val="0"/>
                 <w:sz w:val="18"/>
               </w:rPr>
-              <w:t>新品发布(展会)</w:t>
+              <w:t>半年报预告(扭亏)</w:t>
             </w:r>
           </w:p>
         </w:tc>
@@ -11345,7 +12714,7 @@
                 <w:b w:val="0"/>
                 <w:sz w:val="18"/>
               </w:rPr>
-              <w:t>2026广州建博会亮相，携手天猫精灵打造智慧适老空间，推出A…</w:t>
+              <w:t>预计2026H1归母净利润5000万-7500万元（上年同期…</w:t>
             </w:r>
           </w:p>
         </w:tc>
@@ -11365,7 +12734,7 @@
                 <w:b w:val="0"/>
                 <w:sz w:val="18"/>
               </w:rPr>
-              <w:t>2026-07-09</w:t>
+              <w:t>2026-07-10</w:t>
             </w:r>
           </w:p>
         </w:tc>
@@ -11383,7 +12752,7 @@
                 <w:b w:val="0"/>
                 <w:sz w:val="18"/>
               </w:rPr>
-              <w:t>兔宝宝</w:t>
+              <w:t>九牧集团</w:t>
             </w:r>
           </w:p>
         </w:tc>
@@ -11401,7 +12770,7 @@
                 <w:b w:val="0"/>
                 <w:sz w:val="18"/>
               </w:rPr>
-              <w:t>荣誉/技术</w:t>
+              <w:t>标准发布/技术引领</w:t>
             </w:r>
           </w:p>
         </w:tc>
@@ -11419,7 +12788,7 @@
                 <w:b w:val="0"/>
                 <w:sz w:val="18"/>
               </w:rPr>
-              <w:t>参与项目获2025年度国家科学技术进步奖二等奖，为兔宝宝历史…</w:t>
+              <w:t>作为第一牵头单位主导制定的GB/T 24986.7-2026…</w:t>
             </w:r>
           </w:p>
         </w:tc>
@@ -11440,7 +12809,7 @@
                 <w:b w:val="0"/>
                 <w:sz w:val="18"/>
               </w:rPr>
-              <w:t>2026-07-08</w:t>
+              <w:t>2026-07-09</w:t>
             </w:r>
           </w:p>
         </w:tc>
@@ -11459,7 +12828,7 @@
                 <w:b w:val="0"/>
                 <w:sz w:val="18"/>
               </w:rPr>
-              <w:t>金牌家居(603180)</w:t>
+              <w:t>恒洁卫浴</w:t>
             </w:r>
           </w:p>
         </w:tc>
@@ -11478,7 +12847,7 @@
                 <w:b w:val="0"/>
                 <w:sz w:val="18"/>
               </w:rPr>
-              <w:t>新品/白皮书(展会)</w:t>
+              <w:t>发布会/渠道活动</w:t>
             </w:r>
           </w:p>
         </w:tc>
@@ -11497,7 +12866,7 @@
                 <w:b w:val="0"/>
                 <w:sz w:val="18"/>
               </w:rPr>
-              <w:t>在2026广州建博会发布《中国厨房收纳实用指南》白皮书，升级…</w:t>
+              <w:t>'焕新中国行·乐动此间'恒洁28周年庆启幕（佛山）。全国30…</w:t>
             </w:r>
           </w:p>
         </w:tc>
@@ -11517,7 +12886,7 @@
                 <w:b w:val="0"/>
                 <w:sz w:val="18"/>
               </w:rPr>
-              <w:t>2026-07-08</w:t>
+              <w:t>2026-07-09</w:t>
             </w:r>
           </w:p>
         </w:tc>
@@ -11535,7 +12904,7 @@
                 <w:b w:val="0"/>
                 <w:sz w:val="18"/>
               </w:rPr>
-              <w:t>万华生态</w:t>
+              <w:t>舒达智能</w:t>
             </w:r>
           </w:p>
         </w:tc>
@@ -11553,7 +12922,7 @@
                 <w:b w:val="0"/>
                 <w:sz w:val="18"/>
               </w:rPr>
-              <w:t>新品/供应链(展会)</w:t>
+              <w:t>新品发布(展会)</w:t>
             </w:r>
           </w:p>
         </w:tc>
@@ -11571,7 +12940,7 @@
                 <w:b w:val="0"/>
                 <w:sz w:val="18"/>
               </w:rPr>
-              <w:t>2026广州建博会推'无醛整家'解决方案，展示100㎡住宅7…</w:t>
+              <w:t>2026广州建博会亮相，携手天猫精灵打造智慧适老空间，推出A…</w:t>
             </w:r>
           </w:p>
         </w:tc>
@@ -11592,7 +12961,7 @@
                 <w:b w:val="0"/>
                 <w:sz w:val="18"/>
               </w:rPr>
-              <w:t>2026-07-20</w:t>
+              <w:t>2026-07-09</w:t>
             </w:r>
           </w:p>
         </w:tc>
@@ -11611,7 +12980,7 @@
                 <w:b w:val="0"/>
                 <w:sz w:val="18"/>
               </w:rPr>
-              <w:t>科达制造(600499)</w:t>
+              <w:t>兔宝宝</w:t>
             </w:r>
           </w:p>
         </w:tc>
@@ -11630,7 +12999,7 @@
                 <w:b w:val="0"/>
                 <w:sz w:val="18"/>
               </w:rPr>
-              <w:t>半年报预告(大幅预增)</w:t>
+              <w:t>荣誉/技术</w:t>
             </w:r>
           </w:p>
         </w:tc>
@@ -11649,7 +13018,7 @@
                 <w:b w:val="0"/>
                 <w:sz w:val="18"/>
               </w:rPr>
-              <w:t>预计2026H1归母净利润12.60亿-13.60亿元，同比…</w:t>
+              <w:t>参与项目获2025年度国家科学技术进步奖二等奖，为兔宝宝历史…</w:t>
             </w:r>
           </w:p>
         </w:tc>
@@ -11669,7 +13038,7 @@
                 <w:b w:val="0"/>
                 <w:sz w:val="18"/>
               </w:rPr>
-              <w:t>2026-07-20</w:t>
+              <w:t>2026-07-08</w:t>
             </w:r>
           </w:p>
         </w:tc>
@@ -11687,7 +13056,7 @@
                 <w:b w:val="0"/>
                 <w:sz w:val="18"/>
               </w:rPr>
-              <w:t>松霖科技(603992)</w:t>
+              <w:t>金牌家居(603180)</w:t>
             </w:r>
           </w:p>
         </w:tc>
@@ -11705,7 +13074,7 @@
                 <w:b w:val="0"/>
                 <w:sz w:val="18"/>
               </w:rPr>
-              <w:t>半年报预告(预增)</w:t>
+              <w:t>新品/白皮书(展会)</w:t>
             </w:r>
           </w:p>
         </w:tc>
@@ -11723,7 +13092,7 @@
                 <w:b w:val="0"/>
                 <w:sz w:val="18"/>
               </w:rPr>
-              <w:t>预计2026H1归母净利润1.40亿-1.85亿元，同比增长…</w:t>
+              <w:t>在2026广州建博会发布《中国厨房收纳实用指南》白皮书，升级…</w:t>
             </w:r>
           </w:p>
         </w:tc>
@@ -11744,7 +13113,7 @@
                 <w:b w:val="0"/>
                 <w:sz w:val="18"/>
               </w:rPr>
-              <w:t>2026-07-15</w:t>
+              <w:t>2026-07-08</w:t>
             </w:r>
           </w:p>
         </w:tc>
@@ -11763,7 +13132,7 @@
                 <w:b w:val="0"/>
                 <w:sz w:val="18"/>
               </w:rPr>
-              <w:t>瑞尔特(002790)</w:t>
+              <w:t>万华生态</w:t>
             </w:r>
           </w:p>
         </w:tc>
@@ -11782,7 +13151,7 @@
                 <w:b w:val="0"/>
                 <w:sz w:val="18"/>
               </w:rPr>
-              <w:t>半年报预告(预亏/转亏)</w:t>
+              <w:t>新品/供应链(展会)</w:t>
             </w:r>
           </w:p>
         </w:tc>
@@ -11801,7 +13170,7 @@
                 <w:b w:val="0"/>
                 <w:sz w:val="18"/>
               </w:rPr>
-              <w:t>预计2026H1归母净利润亏损1100万-1600万元，由盈…</w:t>
+              <w:t>2026广州建博会推'无醛整家'解决方案，展示100㎡住宅7…</w:t>
             </w:r>
           </w:p>
         </w:tc>
@@ -11839,7 +13208,7 @@
                 <w:b w:val="0"/>
                 <w:sz w:val="18"/>
               </w:rPr>
-              <w:t>海鸥住工(002084)</w:t>
+              <w:t>科达制造(600499)</w:t>
             </w:r>
           </w:p>
         </w:tc>
@@ -11857,7 +13226,7 @@
                 <w:b w:val="0"/>
                 <w:sz w:val="18"/>
               </w:rPr>
-              <w:t>半年报预告(预亏扩大)</w:t>
+              <w:t>半年报预告(大幅预增)</w:t>
             </w:r>
           </w:p>
         </w:tc>
@@ -11875,7 +13244,7 @@
                 <w:b w:val="0"/>
                 <w:sz w:val="18"/>
               </w:rPr>
-              <w:t>预计2026H1归母净利润亏损3700万-4700万元，亏损…</w:t>
+              <w:t>预计2026H1归母净利润12.60亿-13.60亿元，同比…</w:t>
             </w:r>
           </w:p>
         </w:tc>
@@ -11915,7 +13284,7 @@
                 <w:b w:val="0"/>
                 <w:sz w:val="18"/>
               </w:rPr>
-              <w:t>帝欧家居(002798)</w:t>
+              <w:t>松霖科技(603992)</w:t>
             </w:r>
           </w:p>
         </w:tc>
@@ -11934,7 +13303,7 @@
                 <w:b w:val="0"/>
                 <w:sz w:val="18"/>
               </w:rPr>
-              <w:t>半年报预告(减亏)</w:t>
+              <w:t>半年报预告(预增)</w:t>
             </w:r>
           </w:p>
         </w:tc>
@@ -11953,7 +13322,7 @@
                 <w:b w:val="0"/>
                 <w:sz w:val="18"/>
               </w:rPr>
-              <w:t>预计2026H1归母净利润亏损2300万-3500万元，同比…</w:t>
+              <w:t>预计2026H1归母净利润1.40亿-1.85亿元，同比增长…</w:t>
             </w:r>
           </w:p>
         </w:tc>
@@ -11973,7 +13342,7 @@
                 <w:b w:val="0"/>
                 <w:sz w:val="18"/>
               </w:rPr>
-              <w:t>2026-07-23</w:t>
+              <w:t>2026-07-15</w:t>
             </w:r>
           </w:p>
         </w:tc>
@@ -11991,7 +13360,7 @@
                 <w:b w:val="0"/>
                 <w:sz w:val="18"/>
               </w:rPr>
-              <w:t>爱丽家居(603221)</w:t>
+              <w:t>瑞尔特(002790)</w:t>
             </w:r>
           </w:p>
         </w:tc>
@@ -12009,7 +13378,7 @@
                 <w:b w:val="0"/>
                 <w:sz w:val="18"/>
               </w:rPr>
-              <w:t>重大资产收购意向</w:t>
+              <w:t>半年报预告(预亏/转亏)</w:t>
             </w:r>
           </w:p>
         </w:tc>
@@ -12027,7 +13396,7 @@
                 <w:b w:val="0"/>
                 <w:sz w:val="18"/>
               </w:rPr>
-              <w:t>PVC弹性地板龙头拟收购半导体存储测试设备企业欧康诺不低于7…</w:t>
+              <w:t>预计2026H1归母净利润亏损1100万-1600万元，由盈…</w:t>
             </w:r>
           </w:p>
         </w:tc>
@@ -12048,7 +13417,7 @@
                 <w:b w:val="0"/>
                 <w:sz w:val="18"/>
               </w:rPr>
-              <w:t>2026-07-27</w:t>
+              <w:t>2026-07-20</w:t>
             </w:r>
           </w:p>
         </w:tc>
@@ -12067,7 +13436,7 @@
                 <w:b w:val="0"/>
                 <w:sz w:val="18"/>
               </w:rPr>
-              <w:t>爱丽家居(603221)</w:t>
+              <w:t>海鸥住工(002084)</w:t>
             </w:r>
           </w:p>
         </w:tc>
@@ -12086,7 +13455,7 @@
                 <w:b w:val="0"/>
                 <w:sz w:val="18"/>
               </w:rPr>
-              <w:t>股价异动/风险提示</w:t>
+              <w:t>半年报预告(预亏扩大)</w:t>
             </w:r>
           </w:p>
         </w:tc>
@@ -12105,7 +13474,7 @@
                 <w:b w:val="0"/>
                 <w:sz w:val="18"/>
               </w:rPr>
-              <w:t>7月21-27日连续5涨停累计涨幅61.09%、走出6连板（…</w:t>
+              <w:t>预计2026H1归母净利润亏损3700万-4700万元，亏损…</w:t>
             </w:r>
           </w:p>
         </w:tc>
@@ -12125,7 +13494,7 @@
                 <w:b w:val="0"/>
                 <w:sz w:val="18"/>
               </w:rPr>
-              <w:t>2026-08-07</w:t>
+              <w:t>2026-07-20</w:t>
             </w:r>
           </w:p>
         </w:tc>
@@ -12143,7 +13512,7 @@
                 <w:b w:val="0"/>
                 <w:sz w:val="18"/>
               </w:rPr>
-              <w:t>伟星新材(002372)</w:t>
+              <w:t>帝欧家居(002798)</w:t>
             </w:r>
           </w:p>
         </w:tc>
@@ -12161,7 +13530,7 @@
                 <w:b w:val="0"/>
                 <w:sz w:val="18"/>
               </w:rPr>
-              <w:t>2026年半年报</w:t>
+              <w:t>半年报预告(减亏)</w:t>
             </w:r>
           </w:p>
         </w:tc>
@@ -12179,7 +13548,7 @@
                 <w:b w:val="0"/>
                 <w:sz w:val="18"/>
               </w:rPr>
-              <w:t>营收18.97亿元(-8.71%)、归母净利3.90亿元(+…</w:t>
+              <w:t>预计2026H1归母净利润亏损2300万-3500万元，同比…</w:t>
             </w:r>
           </w:p>
         </w:tc>
@@ -12200,7 +13569,7 @@
                 <w:b w:val="0"/>
                 <w:sz w:val="18"/>
               </w:rPr>
-              <w:t>2026-08-10</w:t>
+              <w:t>2026-07-23</w:t>
             </w:r>
           </w:p>
         </w:tc>
@@ -12219,7 +13588,7 @@
                 <w:b w:val="0"/>
                 <w:sz w:val="18"/>
               </w:rPr>
-              <w:t>悍高集团(001221)</w:t>
+              <w:t>爱丽家居(603221)</w:t>
             </w:r>
           </w:p>
         </w:tc>
@@ -12238,7 +13607,7 @@
                 <w:b w:val="0"/>
                 <w:sz w:val="18"/>
               </w:rPr>
-              <w:t>2026年半年报</w:t>
+              <w:t>重大资产收购意向</w:t>
             </w:r>
           </w:p>
         </w:tc>
@@ -12257,7 +13626,7 @@
                 <w:b w:val="0"/>
                 <w:sz w:val="18"/>
               </w:rPr>
-              <w:t>营收16.78亿元(+15.74%)、归母净利2.92亿元(…</w:t>
+              <w:t>PVC弹性地板龙头拟收购半导体存储测试设备企业欧康诺不低于7…</w:t>
             </w:r>
           </w:p>
         </w:tc>
@@ -12277,7 +13646,7 @@
                 <w:b w:val="0"/>
                 <w:sz w:val="18"/>
               </w:rPr>
-              <w:t>2026-08-11</w:t>
+              <w:t>2026-07-27</w:t>
             </w:r>
           </w:p>
         </w:tc>
@@ -12295,7 +13664,7 @@
                 <w:b w:val="0"/>
                 <w:sz w:val="18"/>
               </w:rPr>
-              <w:t>塔牌集团(002233)</w:t>
+              <w:t>爱丽家居(603221)</w:t>
             </w:r>
           </w:p>
         </w:tc>
@@ -12313,7 +13682,7 @@
                 <w:b w:val="0"/>
                 <w:sz w:val="18"/>
               </w:rPr>
-              <w:t>2026年半年报</w:t>
+              <w:t>股价异动/风险提示</w:t>
             </w:r>
           </w:p>
         </w:tc>
@@ -12331,7 +13700,7 @@
                 <w:b w:val="0"/>
                 <w:sz w:val="18"/>
               </w:rPr>
-              <w:t>营收17.42亿元(-15.30%)、归母净利2.19亿元(…</w:t>
+              <w:t>7月21-27日连续5涨停累计涨幅61.09%、走出6连板（…</w:t>
             </w:r>
           </w:p>
         </w:tc>
@@ -12352,7 +13721,7 @@
                 <w:b w:val="0"/>
                 <w:sz w:val="18"/>
               </w:rPr>
-              <w:t>2026-08-12</w:t>
+              <w:t>2026-08-07</w:t>
             </w:r>
           </w:p>
         </w:tc>
@@ -12371,7 +13740,7 @@
                 <w:b w:val="0"/>
                 <w:sz w:val="18"/>
               </w:rPr>
-              <w:t>江河集团(601886)</w:t>
+              <w:t>伟星新材(002372)</w:t>
             </w:r>
           </w:p>
         </w:tc>
@@ -12409,7 +13778,7 @@
                 <w:b w:val="0"/>
                 <w:sz w:val="18"/>
               </w:rPr>
-              <w:t>营收108.24亿元(+15.90%)、归母净利4.41亿元…</w:t>
+              <w:t>营收18.97亿元(-8.71%)、归母净利3.90亿元(+…</w:t>
             </w:r>
           </w:p>
         </w:tc>
@@ -12429,7 +13798,7 @@
                 <w:b w:val="0"/>
                 <w:sz w:val="18"/>
               </w:rPr>
-              <w:t>2026-08-11</w:t>
+              <w:t>2026-08-10</w:t>
             </w:r>
           </w:p>
         </w:tc>
@@ -12447,7 +13816,7 @@
                 <w:b w:val="0"/>
                 <w:sz w:val="18"/>
               </w:rPr>
-              <w:t>顾家家居(603816)</w:t>
+              <w:t>悍高集团(001221)</w:t>
             </w:r>
           </w:p>
         </w:tc>
@@ -12465,7 +13834,7 @@
                 <w:b w:val="0"/>
                 <w:sz w:val="18"/>
               </w:rPr>
-              <w:t>定增落地/股本变动</w:t>
+              <w:t>2026年半年报</w:t>
             </w:r>
           </w:p>
         </w:tc>
@@ -12483,7 +13852,7 @@
                 <w:b w:val="0"/>
                 <w:sz w:val="18"/>
               </w:rPr>
-              <w:t>2025年度向特定对象发行A股落地：向盈峰集团有限公司发行1…</w:t>
+              <w:t>营收16.78亿元(+15.74%)、归母净利2.92亿元(…</w:t>
             </w:r>
           </w:p>
         </w:tc>
@@ -12523,7 +13892,7 @@
                 <w:b w:val="0"/>
                 <w:sz w:val="18"/>
               </w:rPr>
-              <w:t>居然智家(000785)</w:t>
+              <w:t>塔牌集团(002233)</w:t>
             </w:r>
           </w:p>
         </w:tc>
@@ -12542,7 +13911,7 @@
                 <w:b w:val="0"/>
                 <w:sz w:val="18"/>
               </w:rPr>
-              <w:t>实控人变更进展</w:t>
+              <w:t>2026年半年报</w:t>
             </w:r>
           </w:p>
         </w:tc>
@@ -12561,7 +13930,7 @@
                 <w:b w:val="0"/>
                 <w:sz w:val="18"/>
               </w:rPr>
-              <w:t>原实际控制人汪林朋先生逝世，其配偶杨芳女士通过夫妻共同财产分…</w:t>
+              <w:t>营收17.42亿元(-15.30%)、归母净利2.19亿元(…</w:t>
             </w:r>
           </w:p>
         </w:tc>
@@ -12581,7 +13950,7 @@
                 <w:b w:val="0"/>
                 <w:sz w:val="18"/>
               </w:rPr>
-              <w:t>2026-08-08</w:t>
+              <w:t>2026-08-12</w:t>
             </w:r>
           </w:p>
         </w:tc>
@@ -12599,7 +13968,7 @@
                 <w:b w:val="0"/>
                 <w:sz w:val="18"/>
               </w:rPr>
-              <w:t>惠达卫浴(603385)</w:t>
+              <w:t>江河集团(601886)</w:t>
             </w:r>
           </w:p>
         </w:tc>
@@ -12617,7 +13986,7 @@
                 <w:b w:val="0"/>
                 <w:sz w:val="18"/>
               </w:rPr>
-              <w:t>资产出售进展</w:t>
+              <w:t>2026年半年报</w:t>
             </w:r>
           </w:p>
         </w:tc>
@@ -12635,7 +14004,7 @@
                 <w:b w:val="0"/>
                 <w:sz w:val="18"/>
               </w:rPr>
-              <w:t>出售广西新高盛薄型建陶有限公司100%股权及债权：股权转让价…</w:t>
+              <w:t>营收108.24亿元(+15.90%)、归母净利4.41亿元…</w:t>
             </w:r>
           </w:p>
         </w:tc>
@@ -12656,7 +14025,7 @@
                 <w:b w:val="0"/>
                 <w:sz w:val="18"/>
               </w:rPr>
-              <w:t>2026-08-08</w:t>
+              <w:t>2026-08-11</w:t>
             </w:r>
           </w:p>
         </w:tc>
@@ -12675,7 +14044,7 @@
                 <w:b w:val="0"/>
                 <w:sz w:val="18"/>
               </w:rPr>
-              <w:t>箭牌家居(001322)</w:t>
+              <w:t>顾家家居(603816)</w:t>
             </w:r>
           </w:p>
         </w:tc>
@@ -12694,7 +14063,7 @@
                 <w:b w:val="0"/>
                 <w:sz w:val="18"/>
               </w:rPr>
-              <w:t>股权激励回购注销</w:t>
+              <w:t>定增落地/股本变动</w:t>
             </w:r>
           </w:p>
         </w:tc>
@@ -12713,7 +14082,7 @@
                 <w:b w:val="0"/>
                 <w:sz w:val="18"/>
               </w:rPr>
-              <w:t>2023年限制性股票激励计划回购注销完成：注销1,550,1…</w:t>
+              <w:t>2025年度向特定对象发行A股落地：向盈峰集团有限公司发行1…</w:t>
             </w:r>
           </w:p>
         </w:tc>
@@ -12733,7 +14102,7 @@
                 <w:b w:val="0"/>
                 <w:sz w:val="18"/>
               </w:rPr>
-              <w:t>2026-08-12</w:t>
+              <w:t>2026-08-11</w:t>
             </w:r>
           </w:p>
         </w:tc>
@@ -12751,7 +14120,7 @@
                 <w:b w:val="0"/>
                 <w:sz w:val="18"/>
               </w:rPr>
-              <w:t>欧派家居(603833)</w:t>
+              <w:t>居然智家(000785)</w:t>
             </w:r>
           </w:p>
         </w:tc>
@@ -12769,7 +14138,7 @@
                 <w:b w:val="0"/>
                 <w:sz w:val="18"/>
               </w:rPr>
-              <w:t>募集资金现金管理</w:t>
+              <w:t>实控人变更进展</w:t>
             </w:r>
           </w:p>
         </w:tc>
@@ -12787,7 +14156,7 @@
                 <w:b w:val="0"/>
                 <w:sz w:val="18"/>
               </w:rPr>
-              <w:t>08-11、08-12连续披露《关于使用闲置募集资金进行现金…</w:t>
+              <w:t>原实际控制人汪林朋先生逝世，其配偶杨芳女士通过夫妻共同财产分…</w:t>
             </w:r>
           </w:p>
         </w:tc>
@@ -12808,7 +14177,7 @@
                 <w:b w:val="0"/>
                 <w:sz w:val="18"/>
               </w:rPr>
-              <w:t>2026-08-12</w:t>
+              <w:t>2026-08-08</w:t>
             </w:r>
           </w:p>
         </w:tc>
@@ -12827,7 +14196,7 @@
                 <w:b w:val="0"/>
                 <w:sz w:val="18"/>
               </w:rPr>
-              <w:t>好莱客(603898)</w:t>
+              <w:t>惠达卫浴(603385)</w:t>
             </w:r>
           </w:p>
         </w:tc>
@@ -12846,7 +14215,7 @@
                 <w:b w:val="0"/>
                 <w:sz w:val="18"/>
               </w:rPr>
-              <w:t>对外投资</w:t>
+              <w:t>资产出售进展</w:t>
             </w:r>
           </w:p>
         </w:tc>
@@ -12854,6 +14223,232 @@
           <w:tcPr>
             <w:tcW w:type="dxa" w:w="4252"/>
             <w:shd w:val="clear" w:fill="F4F6F9"/>
+          </w:tcPr>
+          <w:p>
+            <w:pPr>
+              <w:jc w:val="center"/>
+            </w:pPr>
+            <w:r>
+              <w:rPr>
+                <w:rFonts w:ascii="Arial" w:hAnsi="Arial" w:eastAsia="宋体"/>
+                <w:b w:val="0"/>
+                <w:sz w:val="18"/>
+              </w:rPr>
+              <w:t>出售广西新高盛薄型建陶有限公司100%股权及债权：股权转让价…</w:t>
+            </w:r>
+          </w:p>
+        </w:tc>
+      </w:tr>
+      <w:tr>
+        <w:tc>
+          <w:tcPr>
+            <w:tcW w:type="dxa" w:w="1134"/>
+          </w:tcPr>
+          <w:p>
+            <w:pPr>
+              <w:jc w:val="left"/>
+            </w:pPr>
+            <w:r>
+              <w:rPr>
+                <w:rFonts w:ascii="Arial" w:hAnsi="Arial" w:eastAsia="宋体"/>
+                <w:b w:val="0"/>
+                <w:sz w:val="18"/>
+              </w:rPr>
+              <w:t>2026-08-08</w:t>
+            </w:r>
+          </w:p>
+        </w:tc>
+        <w:tc>
+          <w:tcPr>
+            <w:tcW w:type="dxa" w:w="1814"/>
+          </w:tcPr>
+          <w:p>
+            <w:pPr>
+              <w:jc w:val="center"/>
+            </w:pPr>
+            <w:r>
+              <w:rPr>
+                <w:rFonts w:ascii="Arial" w:hAnsi="Arial" w:eastAsia="宋体"/>
+                <w:b w:val="0"/>
+                <w:sz w:val="18"/>
+              </w:rPr>
+              <w:t>箭牌家居(001322)</w:t>
+            </w:r>
+          </w:p>
+        </w:tc>
+        <w:tc>
+          <w:tcPr>
+            <w:tcW w:type="dxa" w:w="1474"/>
+          </w:tcPr>
+          <w:p>
+            <w:pPr>
+              <w:jc w:val="center"/>
+            </w:pPr>
+            <w:r>
+              <w:rPr>
+                <w:rFonts w:ascii="Arial" w:hAnsi="Arial" w:eastAsia="宋体"/>
+                <w:b w:val="0"/>
+                <w:sz w:val="18"/>
+              </w:rPr>
+              <w:t>股权激励回购注销</w:t>
+            </w:r>
+          </w:p>
+        </w:tc>
+        <w:tc>
+          <w:tcPr>
+            <w:tcW w:type="dxa" w:w="4252"/>
+          </w:tcPr>
+          <w:p>
+            <w:pPr>
+              <w:jc w:val="center"/>
+            </w:pPr>
+            <w:r>
+              <w:rPr>
+                <w:rFonts w:ascii="Arial" w:hAnsi="Arial" w:eastAsia="宋体"/>
+                <w:b w:val="0"/>
+                <w:sz w:val="18"/>
+              </w:rPr>
+              <w:t>2023年限制性股票激励计划回购注销完成：注销1,550,1…</w:t>
+            </w:r>
+          </w:p>
+        </w:tc>
+      </w:tr>
+      <w:tr>
+        <w:tc>
+          <w:tcPr>
+            <w:tcW w:type="dxa" w:w="1134"/>
+            <w:shd w:val="clear" w:fill="F4F6F9"/>
+          </w:tcPr>
+          <w:p>
+            <w:pPr>
+              <w:jc w:val="left"/>
+            </w:pPr>
+            <w:r>
+              <w:rPr>
+                <w:rFonts w:ascii="Arial" w:hAnsi="Arial" w:eastAsia="宋体"/>
+                <w:b w:val="0"/>
+                <w:sz w:val="18"/>
+              </w:rPr>
+              <w:t>2026-08-12</w:t>
+            </w:r>
+          </w:p>
+        </w:tc>
+        <w:tc>
+          <w:tcPr>
+            <w:tcW w:type="dxa" w:w="1814"/>
+            <w:shd w:val="clear" w:fill="F4F6F9"/>
+          </w:tcPr>
+          <w:p>
+            <w:pPr>
+              <w:jc w:val="center"/>
+            </w:pPr>
+            <w:r>
+              <w:rPr>
+                <w:rFonts w:ascii="Arial" w:hAnsi="Arial" w:eastAsia="宋体"/>
+                <w:b w:val="0"/>
+                <w:sz w:val="18"/>
+              </w:rPr>
+              <w:t>欧派家居(603833)</w:t>
+            </w:r>
+          </w:p>
+        </w:tc>
+        <w:tc>
+          <w:tcPr>
+            <w:tcW w:type="dxa" w:w="1474"/>
+            <w:shd w:val="clear" w:fill="F4F6F9"/>
+          </w:tcPr>
+          <w:p>
+            <w:pPr>
+              <w:jc w:val="center"/>
+            </w:pPr>
+            <w:r>
+              <w:rPr>
+                <w:rFonts w:ascii="Arial" w:hAnsi="Arial" w:eastAsia="宋体"/>
+                <w:b w:val="0"/>
+                <w:sz w:val="18"/>
+              </w:rPr>
+              <w:t>募集资金现金管理</w:t>
+            </w:r>
+          </w:p>
+        </w:tc>
+        <w:tc>
+          <w:tcPr>
+            <w:tcW w:type="dxa" w:w="4252"/>
+            <w:shd w:val="clear" w:fill="F4F6F9"/>
+          </w:tcPr>
+          <w:p>
+            <w:pPr>
+              <w:jc w:val="center"/>
+            </w:pPr>
+            <w:r>
+              <w:rPr>
+                <w:rFonts w:ascii="Arial" w:hAnsi="Arial" w:eastAsia="宋体"/>
+                <w:b w:val="0"/>
+                <w:sz w:val="18"/>
+              </w:rPr>
+              <w:t>08-11、08-12连续披露《关于使用闲置募集资金进行现金…</w:t>
+            </w:r>
+          </w:p>
+        </w:tc>
+      </w:tr>
+      <w:tr>
+        <w:tc>
+          <w:tcPr>
+            <w:tcW w:type="dxa" w:w="1134"/>
+          </w:tcPr>
+          <w:p>
+            <w:pPr>
+              <w:jc w:val="left"/>
+            </w:pPr>
+            <w:r>
+              <w:rPr>
+                <w:rFonts w:ascii="Arial" w:hAnsi="Arial" w:eastAsia="宋体"/>
+                <w:b w:val="0"/>
+                <w:sz w:val="18"/>
+              </w:rPr>
+              <w:t>2026-08-12</w:t>
+            </w:r>
+          </w:p>
+        </w:tc>
+        <w:tc>
+          <w:tcPr>
+            <w:tcW w:type="dxa" w:w="1814"/>
+          </w:tcPr>
+          <w:p>
+            <w:pPr>
+              <w:jc w:val="center"/>
+            </w:pPr>
+            <w:r>
+              <w:rPr>
+                <w:rFonts w:ascii="Arial" w:hAnsi="Arial" w:eastAsia="宋体"/>
+                <w:b w:val="0"/>
+                <w:sz w:val="18"/>
+              </w:rPr>
+              <w:t>好莱客(603898)</w:t>
+            </w:r>
+          </w:p>
+        </w:tc>
+        <w:tc>
+          <w:tcPr>
+            <w:tcW w:type="dxa" w:w="1474"/>
+          </w:tcPr>
+          <w:p>
+            <w:pPr>
+              <w:jc w:val="center"/>
+            </w:pPr>
+            <w:r>
+              <w:rPr>
+                <w:rFonts w:ascii="Arial" w:hAnsi="Arial" w:eastAsia="宋体"/>
+                <w:b w:val="0"/>
+                <w:sz w:val="18"/>
+              </w:rPr>
+              <w:t>对外投资</w:t>
+            </w:r>
+          </w:p>
+        </w:tc>
+        <w:tc>
+          <w:tcPr>
+            <w:tcW w:type="dxa" w:w="4252"/>
           </w:tcPr>
           <w:p>
             <w:pPr>

</xml_diff>